<commit_message>
Padding and page numbers are added
</commit_message>
<xml_diff>
--- a/task4/Отчёт.docx
+++ b/task4/Отчёт.docx
@@ -1372,6 +1372,33 @@
               <w:fldChar w:fldCharType="end"/>
             </w:r>
           </w:p>
+          <w:p>
+            <w:pPr>
+              <w:rPr>
+                <w:rFonts w:cstheme="minorHAnsi"/>
+                <w:sz w:val="24"/>
+                <w:szCs w:val="24"/>
+              </w:rPr>
+            </w:pPr>
+          </w:p>
+          <w:p>
+            <w:pPr>
+              <w:rPr>
+                <w:rFonts w:cstheme="minorHAnsi"/>
+                <w:sz w:val="24"/>
+                <w:szCs w:val="24"/>
+              </w:rPr>
+            </w:pPr>
+          </w:p>
+          <w:p>
+            <w:pPr>
+              <w:rPr>
+                <w:rFonts w:cstheme="minorHAnsi"/>
+                <w:sz w:val="24"/>
+                <w:szCs w:val="24"/>
+              </w:rPr>
+            </w:pPr>
+          </w:p>
         </w:tc>
       </w:tr>
     </w:tbl>
@@ -1389,7 +1416,15 @@
         <w:pStyle w:val="a6"/>
       </w:pPr>
       <w:r>
-        <w:t>Целью работы является изучение файловой системы ОС Linux и приобретение практических навыков применения команд для анализа файловой системы, управления файлами и процессами.</w:t>
+        <w:t xml:space="preserve">Целью работы является изучение файловой системы ОС </w:t>
+      </w:r>
+      <w:proofErr w:type="spellStart"/>
+      <w:r>
+        <w:t>Linux</w:t>
+      </w:r>
+      <w:proofErr w:type="spellEnd"/>
+      <w:r>
+        <w:t xml:space="preserve"> и приобретение практических навыков применения команд для анализа файловой системы, управления файлами и процессами.</w:t>
       </w:r>
     </w:p>
     <w:p>
@@ -1433,8 +1468,30 @@
         <w:rPr>
           <w:b/>
         </w:rPr>
-        <w:t>/proc/partitions</w:t>
-      </w:r>
+        <w:t>/</w:t>
+      </w:r>
+      <w:proofErr w:type="spellStart"/>
+      <w:r>
+        <w:rPr>
+          <w:b/>
+        </w:rPr>
+        <w:t>proc</w:t>
+      </w:r>
+      <w:proofErr w:type="spellEnd"/>
+      <w:r>
+        <w:rPr>
+          <w:b/>
+        </w:rPr>
+        <w:t>/</w:t>
+      </w:r>
+      <w:proofErr w:type="spellStart"/>
+      <w:r>
+        <w:rPr>
+          <w:b/>
+        </w:rPr>
+        <w:t>partitions</w:t>
+      </w:r>
+      <w:proofErr w:type="spellEnd"/>
       <w:r>
         <w:t>, определите количество разделов в файловой системе сервера и количество драйверов, управляющих этими разделами.</w:t>
       </w:r>
@@ -1450,8 +1507,30 @@
         <w:rPr>
           <w:b/>
         </w:rPr>
-        <w:t>/proc/partitions</w:t>
-      </w:r>
+        <w:t>/</w:t>
+      </w:r>
+      <w:proofErr w:type="spellStart"/>
+      <w:r>
+        <w:rPr>
+          <w:b/>
+        </w:rPr>
+        <w:t>proc</w:t>
+      </w:r>
+      <w:proofErr w:type="spellEnd"/>
+      <w:r>
+        <w:rPr>
+          <w:b/>
+        </w:rPr>
+        <w:t>/</w:t>
+      </w:r>
+      <w:proofErr w:type="spellStart"/>
+      <w:r>
+        <w:rPr>
+          <w:b/>
+        </w:rPr>
+        <w:t>partitions</w:t>
+      </w:r>
+      <w:proofErr w:type="spellEnd"/>
       <w:r>
         <w:t>:</w:t>
       </w:r>
@@ -1478,7 +1557,7 @@
             <v:path o:extrusionok="f" gradientshapeok="t" o:connecttype="rect"/>
             <o:lock v:ext="edit" aspectratio="t"/>
           </v:shapetype>
-          <v:shape id="_x0000_i1025" type="#_x0000_t75" style="width:311.6pt;height:131.9pt">
+          <v:shape id="_x0000_i1025" type="#_x0000_t75" style="width:311.75pt;height:131.75pt">
             <v:imagedata r:id="rId12" o:title="s1_t1"/>
           </v:shape>
         </w:pict>
@@ -1531,21 +1610,25 @@
       <w:r>
         <w:t xml:space="preserve"> (</w:t>
       </w:r>
+      <w:proofErr w:type="spellStart"/>
       <w:r>
         <w:rPr>
           <w:lang w:val="en-US"/>
         </w:rPr>
         <w:t>sda</w:t>
       </w:r>
+      <w:proofErr w:type="spellEnd"/>
       <w:r>
         <w:t xml:space="preserve">1, </w:t>
       </w:r>
+      <w:proofErr w:type="spellStart"/>
       <w:r>
         <w:rPr>
           <w:lang w:val="en-US"/>
         </w:rPr>
         <w:t>sda</w:t>
       </w:r>
+      <w:proofErr w:type="spellEnd"/>
       <w:r>
         <w:t>2</w:t>
       </w:r>
@@ -1570,42 +1653,50 @@
       <w:r>
         <w:t>): 4 (</w:t>
       </w:r>
+      <w:proofErr w:type="spellStart"/>
       <w:r>
         <w:rPr>
           <w:lang w:val="en-US"/>
         </w:rPr>
         <w:t>dm</w:t>
       </w:r>
+      <w:proofErr w:type="spellEnd"/>
       <w:r>
         <w:t>-0</w:t>
       </w:r>
       <w:r>
         <w:t xml:space="preserve">, </w:t>
       </w:r>
+      <w:proofErr w:type="spellStart"/>
       <w:r>
         <w:rPr>
           <w:lang w:val="en-US"/>
         </w:rPr>
         <w:t>dm</w:t>
       </w:r>
+      <w:proofErr w:type="spellEnd"/>
       <w:r>
         <w:t xml:space="preserve">-1, </w:t>
       </w:r>
+      <w:proofErr w:type="spellStart"/>
       <w:r>
         <w:rPr>
           <w:lang w:val="en-US"/>
         </w:rPr>
         <w:t>dm</w:t>
       </w:r>
+      <w:proofErr w:type="spellEnd"/>
       <w:r>
         <w:t xml:space="preserve">-2, </w:t>
       </w:r>
+      <w:proofErr w:type="spellStart"/>
       <w:r>
         <w:rPr>
           <w:lang w:val="en-US"/>
         </w:rPr>
         <w:t>dm</w:t>
       </w:r>
+      <w:proofErr w:type="spellEnd"/>
       <w:r>
         <w:t>-</w:t>
       </w:r>
@@ -1671,7 +1762,23 @@
         <w:pStyle w:val="a6"/>
       </w:pPr>
       <w:r>
-        <w:t>С помощью команд lsblk и df определите основные характеристики разделов внешней памяти сервера (имя и номер устройства, имя и тип раздела, размер, тип файловой системы, коэффициент использования памяти) и сравните их с результатами п.2. Результаты предс</w:t>
+        <w:t xml:space="preserve">С помощью команд </w:t>
+      </w:r>
+      <w:proofErr w:type="spellStart"/>
+      <w:r>
+        <w:t>lsblk</w:t>
+      </w:r>
+      <w:proofErr w:type="spellEnd"/>
+      <w:r>
+        <w:t xml:space="preserve"> и </w:t>
+      </w:r>
+      <w:proofErr w:type="spellStart"/>
+      <w:r>
+        <w:t>df</w:t>
+      </w:r>
+      <w:proofErr w:type="spellEnd"/>
+      <w:r>
+        <w:t xml:space="preserve"> определите основные характеристики разделов внешней памяти сервера (имя и номер устройства, имя и тип раздела, размер, тип файловой системы, коэффициент использования памяти) и сравните их с результатами п.2. Результаты предс</w:t>
       </w:r>
       <w:r>
         <w:t>тавьте в виде следующей таблицы</w:t>
@@ -1687,11 +1794,33 @@
       <w:r>
         <w:t xml:space="preserve">Используя команду </w:t>
       </w:r>
+      <w:proofErr w:type="spellStart"/>
       <w:r>
         <w:rPr>
           <w:b/>
         </w:rPr>
-        <w:t>lsblk -o NAME,KNAME,MAJ:MIN,FSTYPE,SIZE</w:t>
+        <w:t>lsblk</w:t>
+      </w:r>
+      <w:proofErr w:type="spellEnd"/>
+      <w:r>
+        <w:rPr>
+          <w:b/>
+        </w:rPr>
+        <w:t xml:space="preserve"> -o </w:t>
+      </w:r>
+      <w:proofErr w:type="gramStart"/>
+      <w:r>
+        <w:rPr>
+          <w:b/>
+        </w:rPr>
+        <w:t>NAME,KNAME</w:t>
+      </w:r>
+      <w:proofErr w:type="gramEnd"/>
+      <w:r>
+        <w:rPr>
+          <w:b/>
+        </w:rPr>
+        <w:t>,MAJ:MIN,FSTYPE,SIZE</w:t>
       </w:r>
       <w:r>
         <w:t xml:space="preserve">, </w:t>
@@ -1705,12 +1834,14 @@
       <w:r>
         <w:t xml:space="preserve"> об имени устройства, номере драйвера, типе файловой системы и размере:</w:t>
       </w:r>
+      <w:bookmarkStart w:id="1" w:name="_GoBack"/>
+      <w:bookmarkEnd w:id="1"/>
     </w:p>
     <w:p>
       <w:r>
         <w:lastRenderedPageBreak/>
         <w:pict>
-          <v:shape id="_x0000_i1026" type="#_x0000_t75" style="width:394.55pt;height:107.7pt">
+          <v:shape id="_x0000_i1026" type="#_x0000_t75" style="width:394.65pt;height:108pt">
             <v:imagedata r:id="rId13" o:title="s1_t2_1"/>
           </v:shape>
         </w:pict>
@@ -1723,24 +1854,34 @@
       <w:r>
         <w:t xml:space="preserve">Используя команду </w:t>
       </w:r>
+      <w:proofErr w:type="spellStart"/>
       <w:r>
         <w:rPr>
           <w:b/>
         </w:rPr>
-        <w:t xml:space="preserve">df </w:t>
-      </w:r>
+        <w:t>df</w:t>
+      </w:r>
+      <w:proofErr w:type="spellEnd"/>
       <w:r>
         <w:rPr>
           <w:b/>
         </w:rPr>
+        <w:t xml:space="preserve"> </w:t>
+      </w:r>
+      <w:r>
+        <w:rPr>
+          <w:b/>
+        </w:rPr>
         <w:t>-</w:t>
       </w:r>
+      <w:proofErr w:type="spellStart"/>
       <w:r>
         <w:rPr>
           <w:b/>
         </w:rPr>
         <w:t>hT</w:t>
       </w:r>
+      <w:proofErr w:type="spellEnd"/>
       <w:r>
         <w:t xml:space="preserve"> (опция -</w:t>
       </w:r>
@@ -1781,7 +1922,7 @@
     <w:p>
       <w:r>
         <w:pict>
-          <v:shape id="_x0000_i1027" type="#_x0000_t75" style="width:437.75pt;height:138.8pt">
+          <v:shape id="_x0000_i1027" type="#_x0000_t75" style="width:437.45pt;height:138.55pt">
             <v:imagedata r:id="rId14" o:title="s1_t2_2"/>
           </v:shape>
         </w:pict>
@@ -1997,6 +2138,7 @@
                 <w:lang w:val="en-US"/>
               </w:rPr>
             </w:pPr>
+            <w:proofErr w:type="spellStart"/>
             <w:r>
               <w:rPr>
                 <w:sz w:val="24"/>
@@ -2004,6 +2146,7 @@
               </w:rPr>
               <w:t>sda</w:t>
             </w:r>
+            <w:proofErr w:type="spellEnd"/>
           </w:p>
         </w:tc>
         <w:tc>
@@ -2086,6 +2229,7 @@
                 <w:lang w:val="en-US"/>
               </w:rPr>
             </w:pPr>
+            <w:proofErr w:type="spellStart"/>
             <w:r>
               <w:rPr>
                 <w:sz w:val="24"/>
@@ -2093,6 +2237,7 @@
               </w:rPr>
               <w:t>xfs</w:t>
             </w:r>
+            <w:proofErr w:type="spellEnd"/>
           </w:p>
         </w:tc>
         <w:tc>
@@ -2174,6 +2319,7 @@
                 <w:lang w:val="en-US"/>
               </w:rPr>
             </w:pPr>
+            <w:proofErr w:type="spellStart"/>
             <w:r>
               <w:rPr>
                 <w:sz w:val="24"/>
@@ -2181,6 +2327,7 @@
               </w:rPr>
               <w:t>sda</w:t>
             </w:r>
+            <w:proofErr w:type="spellEnd"/>
           </w:p>
         </w:tc>
         <w:tc>
@@ -2344,6 +2491,7 @@
                 <w:lang w:val="en-US"/>
               </w:rPr>
             </w:pPr>
+            <w:proofErr w:type="spellStart"/>
             <w:r>
               <w:rPr>
                 <w:sz w:val="24"/>
@@ -2351,6 +2499,7 @@
               </w:rPr>
               <w:t>sda</w:t>
             </w:r>
+            <w:proofErr w:type="spellEnd"/>
           </w:p>
         </w:tc>
         <w:tc>
@@ -2507,6 +2656,7 @@
                 <w:lang w:val="en-US"/>
               </w:rPr>
             </w:pPr>
+            <w:proofErr w:type="spellStart"/>
             <w:r>
               <w:rPr>
                 <w:sz w:val="24"/>
@@ -2514,6 +2664,7 @@
               </w:rPr>
               <w:t>sda</w:t>
             </w:r>
+            <w:proofErr w:type="spellEnd"/>
           </w:p>
         </w:tc>
         <w:tc>
@@ -2677,6 +2828,7 @@
                 <w:lang w:val="en-US"/>
               </w:rPr>
             </w:pPr>
+            <w:proofErr w:type="spellStart"/>
             <w:r>
               <w:rPr>
                 <w:sz w:val="24"/>
@@ -2684,6 +2836,7 @@
               </w:rPr>
               <w:t>sda</w:t>
             </w:r>
+            <w:proofErr w:type="spellEnd"/>
           </w:p>
         </w:tc>
         <w:tc>
@@ -2703,8 +2856,17 @@
                 <w:sz w:val="24"/>
                 <w:lang w:val="en-US"/>
               </w:rPr>
-              <w:t>centos-tmp</w:t>
-            </w:r>
+              <w:t>centos-</w:t>
+            </w:r>
+            <w:proofErr w:type="spellStart"/>
+            <w:r>
+              <w:rPr>
+                <w:sz w:val="24"/>
+                <w:lang w:val="en-US"/>
+              </w:rPr>
+              <w:t>tmp</w:t>
+            </w:r>
+            <w:proofErr w:type="spellEnd"/>
           </w:p>
         </w:tc>
         <w:tc>
@@ -2847,6 +3009,7 @@
                 <w:lang w:val="en-US"/>
               </w:rPr>
             </w:pPr>
+            <w:proofErr w:type="spellStart"/>
             <w:r>
               <w:rPr>
                 <w:sz w:val="24"/>
@@ -2854,6 +3017,7 @@
               </w:rPr>
               <w:t>sda</w:t>
             </w:r>
+            <w:proofErr w:type="spellEnd"/>
           </w:p>
         </w:tc>
         <w:tc>
@@ -3181,21 +3345,25 @@
       <w:r>
         <w:t xml:space="preserve">С помощью команд </w:t>
       </w:r>
+      <w:proofErr w:type="spellStart"/>
       <w:r>
         <w:rPr>
           <w:b/>
         </w:rPr>
         <w:t>df</w:t>
       </w:r>
+      <w:proofErr w:type="spellEnd"/>
       <w:r>
         <w:t xml:space="preserve"> и </w:t>
       </w:r>
+      <w:proofErr w:type="spellStart"/>
       <w:r>
         <w:rPr>
           <w:b/>
         </w:rPr>
         <w:t>du</w:t>
       </w:r>
+      <w:proofErr w:type="spellEnd"/>
       <w:r>
         <w:t xml:space="preserve"> определите типы файловых систем, используемых на сервере, а также в каком из имеющихся разделов расположен ваш домашний каталог и размер домашнего каталога. Поясните назначение каждой из файловых систем.</w:t>
       </w:r>
@@ -3268,7 +3436,21 @@
         <w:rPr>
           <w:szCs w:val="28"/>
         </w:rPr>
-        <w:t xml:space="preserve">– основная файловая система в Linux. В нашем случае применяется для каталогов </w:t>
+        <w:t xml:space="preserve">– основная файловая система в </w:t>
+      </w:r>
+      <w:proofErr w:type="spellStart"/>
+      <w:r>
+        <w:rPr>
+          <w:szCs w:val="28"/>
+        </w:rPr>
+        <w:t>Linux</w:t>
+      </w:r>
+      <w:proofErr w:type="spellEnd"/>
+      <w:r>
+        <w:rPr>
+          <w:szCs w:val="28"/>
+        </w:rPr>
+        <w:t xml:space="preserve">. В нашем случае применяется для каталогов </w:t>
       </w:r>
       <w:r>
         <w:rPr>
@@ -3292,14 +3474,9 @@
           <w:sz w:val="28"/>
           <w:szCs w:val="28"/>
         </w:rPr>
-        <w:t>/home</w:t>
-      </w:r>
-      <w:r>
-        <w:rPr>
-          <w:szCs w:val="28"/>
-        </w:rPr>
-        <w:t xml:space="preserve"> и </w:t>
-      </w:r>
+        <w:t>/</w:t>
+      </w:r>
+      <w:proofErr w:type="spellStart"/>
       <w:r>
         <w:rPr>
           <w:rStyle w:val="HTML"/>
@@ -3307,34 +3484,14 @@
           <w:sz w:val="28"/>
           <w:szCs w:val="28"/>
         </w:rPr>
-        <w:t>/tmp</w:t>
-      </w:r>
+        <w:t>home</w:t>
+      </w:r>
+      <w:proofErr w:type="spellEnd"/>
       <w:r>
         <w:rPr>
           <w:szCs w:val="28"/>
         </w:rPr>
-        <w:t>. Надёжна и поддерживает журналирование.</w:t>
-      </w:r>
-    </w:p>
-    <w:p>
-      <w:pPr>
-        <w:pStyle w:val="a6"/>
-        <w:rPr>
-          <w:szCs w:val="28"/>
-        </w:rPr>
-      </w:pPr>
-      <w:r>
-        <w:rPr>
-          <w:rStyle w:val="ab"/>
-          <w:szCs w:val="28"/>
-        </w:rPr>
-        <w:t>devtmpfs</w:t>
-      </w:r>
-      <w:r>
-        <w:rPr>
-          <w:szCs w:val="28"/>
-        </w:rPr>
-        <w:t xml:space="preserve"> – специальная файловая система, с которой работает ядро для управления устройствами в каталоге </w:t>
+        <w:t xml:space="preserve"> и </w:t>
       </w:r>
       <w:r>
         <w:rPr>
@@ -3343,50 +3500,128 @@
           <w:sz w:val="28"/>
           <w:szCs w:val="28"/>
         </w:rPr>
-        <w:t>/dev</w:t>
-      </w:r>
-      <w:r>
-        <w:rPr>
+        <w:t>/</w:t>
+      </w:r>
+      <w:proofErr w:type="spellStart"/>
+      <w:r>
+        <w:rPr>
+          <w:rStyle w:val="HTML"/>
+          <w:rFonts w:ascii="Times New Roman" w:eastAsia="Calibri" w:hAnsi="Times New Roman" w:cs="Times New Roman"/>
+          <w:sz w:val="28"/>
           <w:szCs w:val="28"/>
         </w:rPr>
-        <w:t>. Автоматически создаёт и удаляет файлы устройств при их подключении или отключении.</w:t>
-      </w:r>
-    </w:p>
-    <w:p>
-      <w:pPr>
-        <w:pStyle w:val="a6"/>
+        <w:t>tmp</w:t>
+      </w:r>
+      <w:proofErr w:type="spellEnd"/>
+      <w:r>
         <w:rPr>
           <w:szCs w:val="28"/>
         </w:rPr>
-      </w:pPr>
+        <w:t xml:space="preserve">. Надёжна и поддерживает </w:t>
+      </w:r>
+      <w:proofErr w:type="spellStart"/>
+      <w:r>
+        <w:rPr>
+          <w:szCs w:val="28"/>
+        </w:rPr>
+        <w:t>журналирование</w:t>
+      </w:r>
+      <w:proofErr w:type="spellEnd"/>
+      <w:r>
+        <w:rPr>
+          <w:szCs w:val="28"/>
+        </w:rPr>
+        <w:t>.</w:t>
+      </w:r>
+    </w:p>
+    <w:p>
+      <w:pPr>
+        <w:pStyle w:val="a6"/>
+        <w:rPr>
+          <w:szCs w:val="28"/>
+        </w:rPr>
+      </w:pPr>
+      <w:proofErr w:type="spellStart"/>
       <w:r>
         <w:rPr>
           <w:rStyle w:val="ab"/>
           <w:szCs w:val="28"/>
         </w:rPr>
-        <w:t>tmpfs</w:t>
-      </w:r>
+        <w:t>devtmpfs</w:t>
+      </w:r>
+      <w:proofErr w:type="spellEnd"/>
       <w:r>
         <w:rPr>
           <w:szCs w:val="28"/>
         </w:rPr>
-        <w:t xml:space="preserve"> – временная файловая система, размещённая в оперативной памяти. Используется для хранения временных данных, которые исчезают после перезагрузки.</w:t>
-      </w:r>
-    </w:p>
-    <w:p>
-      <w:pPr>
-        <w:pStyle w:val="a6"/>
-        <w:rPr>
+        <w:t xml:space="preserve"> – специальная файловая система, с которой работает ядро для управления устройствами в каталоге </w:t>
+      </w:r>
+      <w:r>
+        <w:rPr>
+          <w:rStyle w:val="HTML"/>
+          <w:rFonts w:ascii="Times New Roman" w:eastAsia="Calibri" w:hAnsi="Times New Roman" w:cs="Times New Roman"/>
+          <w:sz w:val="28"/>
           <w:szCs w:val="28"/>
         </w:rPr>
-      </w:pPr>
+        <w:t>/</w:t>
+      </w:r>
+      <w:proofErr w:type="spellStart"/>
+      <w:r>
+        <w:rPr>
+          <w:rStyle w:val="HTML"/>
+          <w:rFonts w:ascii="Times New Roman" w:eastAsia="Calibri" w:hAnsi="Times New Roman" w:cs="Times New Roman"/>
+          <w:sz w:val="28"/>
+          <w:szCs w:val="28"/>
+        </w:rPr>
+        <w:t>dev</w:t>
+      </w:r>
+      <w:proofErr w:type="spellEnd"/>
+      <w:r>
+        <w:rPr>
+          <w:szCs w:val="28"/>
+        </w:rPr>
+        <w:t>. Автоматически создаёт и удаляет файлы устройств при их подключении или отключении.</w:t>
+      </w:r>
+    </w:p>
+    <w:p>
+      <w:pPr>
+        <w:pStyle w:val="a6"/>
+        <w:rPr>
+          <w:szCs w:val="28"/>
+        </w:rPr>
+      </w:pPr>
+      <w:proofErr w:type="spellStart"/>
       <w:r>
         <w:rPr>
           <w:rStyle w:val="ab"/>
           <w:szCs w:val="28"/>
         </w:rPr>
+        <w:t>tmpfs</w:t>
+      </w:r>
+      <w:proofErr w:type="spellEnd"/>
+      <w:r>
+        <w:rPr>
+          <w:szCs w:val="28"/>
+        </w:rPr>
+        <w:t xml:space="preserve"> – временная файловая система, размещённая в оперативной памяти. Используется для хранения временных данных, которые исчезают после перезагрузки.</w:t>
+      </w:r>
+    </w:p>
+    <w:p>
+      <w:pPr>
+        <w:pStyle w:val="a6"/>
+        <w:rPr>
+          <w:szCs w:val="28"/>
+        </w:rPr>
+      </w:pPr>
+      <w:proofErr w:type="spellStart"/>
+      <w:r>
+        <w:rPr>
+          <w:rStyle w:val="ab"/>
+          <w:szCs w:val="28"/>
+        </w:rPr>
         <w:t>xfs</w:t>
       </w:r>
+      <w:proofErr w:type="spellEnd"/>
       <w:r>
         <w:rPr>
           <w:szCs w:val="28"/>
@@ -3403,15 +3638,34 @@
         <w:rPr>
           <w:szCs w:val="28"/>
         </w:rPr>
-        <w:t xml:space="preserve"> производительная и журналируемая файловая система, часто применяемая на больших разделах. В нашем случае используется для раздела </w:t>
-      </w:r>
-      <w:r>
-        <w:t>/boot</w:t>
-      </w:r>
+        <w:t xml:space="preserve"> производительная и </w:t>
+      </w:r>
+      <w:proofErr w:type="spellStart"/>
       <w:r>
         <w:rPr>
           <w:szCs w:val="28"/>
         </w:rPr>
+        <w:t>журналируемая</w:t>
+      </w:r>
+      <w:proofErr w:type="spellEnd"/>
+      <w:r>
+        <w:rPr>
+          <w:szCs w:val="28"/>
+        </w:rPr>
+        <w:t xml:space="preserve"> файловая система, часто применяемая на больших разделах. В нашем случае используется для раздела </w:t>
+      </w:r>
+      <w:r>
+        <w:t>/</w:t>
+      </w:r>
+      <w:proofErr w:type="spellStart"/>
+      <w:r>
+        <w:t>boot</w:t>
+      </w:r>
+      <w:proofErr w:type="spellEnd"/>
+      <w:r>
+        <w:rPr>
+          <w:szCs w:val="28"/>
+        </w:rPr>
         <w:t>.</w:t>
       </w:r>
       <w:r>
@@ -3430,7 +3684,49 @@
         <w:rPr>
           <w:szCs w:val="28"/>
         </w:rPr>
-        <w:t>обычно для /boot используют ext4, потому что xfs не всегда поддерживается загрузчиками (например, GRUB2). Однако использование xfs возможно, если загрузчик с этим справляется.</w:t>
+        <w:t>обычно для /</w:t>
+      </w:r>
+      <w:proofErr w:type="spellStart"/>
+      <w:r>
+        <w:rPr>
+          <w:szCs w:val="28"/>
+        </w:rPr>
+        <w:t>boot</w:t>
+      </w:r>
+      <w:proofErr w:type="spellEnd"/>
+      <w:r>
+        <w:rPr>
+          <w:szCs w:val="28"/>
+        </w:rPr>
+        <w:t xml:space="preserve"> используют ext4, потому что </w:t>
+      </w:r>
+      <w:proofErr w:type="spellStart"/>
+      <w:r>
+        <w:rPr>
+          <w:szCs w:val="28"/>
+        </w:rPr>
+        <w:t>xfs</w:t>
+      </w:r>
+      <w:proofErr w:type="spellEnd"/>
+      <w:r>
+        <w:rPr>
+          <w:szCs w:val="28"/>
+        </w:rPr>
+        <w:t xml:space="preserve"> не всегда поддерживается загрузчиками (например, GRUB2). Однако использование </w:t>
+      </w:r>
+      <w:proofErr w:type="spellStart"/>
+      <w:r>
+        <w:rPr>
+          <w:szCs w:val="28"/>
+        </w:rPr>
+        <w:t>xfs</w:t>
+      </w:r>
+      <w:proofErr w:type="spellEnd"/>
+      <w:r>
+        <w:rPr>
+          <w:szCs w:val="28"/>
+        </w:rPr>
+        <w:t xml:space="preserve"> возможно, если загрузчик с этим справляется.</w:t>
       </w:r>
     </w:p>
     <w:p>
@@ -3647,12 +3943,14 @@
       <w:r>
         <w:t xml:space="preserve">Откройте второе соединение с сервером, в котором командой </w:t>
       </w:r>
+      <w:proofErr w:type="spellStart"/>
       <w:r>
         <w:rPr>
           <w:b/>
         </w:rPr>
         <w:t>top</w:t>
       </w:r>
+      <w:proofErr w:type="spellEnd"/>
       <w:r>
         <w:t xml:space="preserve"> включите мониторинг Ваших процессов и определите:</w:t>
       </w:r>
@@ -3717,12 +4015,14 @@
       <w:r>
         <w:t xml:space="preserve">Дальнейшие действия выполняйте в первом соединении, а во втором соединении фиксируйте соответствующие изменения. Команду </w:t>
       </w:r>
+      <w:proofErr w:type="spellStart"/>
       <w:r>
         <w:rPr>
           <w:b/>
         </w:rPr>
         <w:t>top</w:t>
       </w:r>
+      <w:proofErr w:type="spellEnd"/>
       <w:r>
         <w:t xml:space="preserve"> используйте в режиме фильтрации по имени пользователя</w:t>
       </w:r>
@@ -4119,8 +4419,16 @@
         <w:rPr>
           <w:lang w:eastAsia="ru-RU"/>
         </w:rPr>
-        <w:t xml:space="preserve"> MiB</w:t>
-      </w:r>
+        <w:t xml:space="preserve"> </w:t>
+      </w:r>
+      <w:proofErr w:type="spellStart"/>
+      <w:r>
+        <w:rPr>
+          <w:lang w:eastAsia="ru-RU"/>
+        </w:rPr>
+        <w:t>MiB</w:t>
+      </w:r>
+      <w:proofErr w:type="spellEnd"/>
     </w:p>
     <w:p>
       <w:pPr>
@@ -4150,8 +4458,16 @@
         <w:rPr>
           <w:lang w:eastAsia="ru-RU"/>
         </w:rPr>
-        <w:t xml:space="preserve"> MiB</w:t>
-      </w:r>
+        <w:t xml:space="preserve"> </w:t>
+      </w:r>
+      <w:proofErr w:type="spellStart"/>
+      <w:r>
+        <w:rPr>
+          <w:lang w:eastAsia="ru-RU"/>
+        </w:rPr>
+        <w:t>MiB</w:t>
+      </w:r>
+      <w:proofErr w:type="spellEnd"/>
     </w:p>
     <w:p>
       <w:pPr>
@@ -4181,8 +4497,16 @@
         <w:rPr>
           <w:lang w:eastAsia="ru-RU"/>
         </w:rPr>
-        <w:t xml:space="preserve"> MiB</w:t>
-      </w:r>
+        <w:t xml:space="preserve"> </w:t>
+      </w:r>
+      <w:proofErr w:type="spellStart"/>
+      <w:r>
+        <w:rPr>
+          <w:lang w:eastAsia="ru-RU"/>
+        </w:rPr>
+        <w:t>MiB</w:t>
+      </w:r>
+      <w:proofErr w:type="spellEnd"/>
     </w:p>
     <w:p>
       <w:pPr>
@@ -4196,25 +4520,55 @@
           <w:lang w:eastAsia="ru-RU"/>
         </w:rPr>
       </w:pPr>
+      <w:proofErr w:type="spellStart"/>
       <w:r>
         <w:rPr>
           <w:lang w:eastAsia="ru-RU"/>
         </w:rPr>
         <w:lastRenderedPageBreak/>
-        <w:t>Buff/Cache: 1763.</w:t>
-      </w:r>
+        <w:t>Buff</w:t>
+      </w:r>
+      <w:proofErr w:type="spellEnd"/>
       <w:r>
         <w:rPr>
           <w:lang w:eastAsia="ru-RU"/>
         </w:rPr>
+        <w:t>/</w:t>
+      </w:r>
+      <w:proofErr w:type="spellStart"/>
+      <w:r>
+        <w:rPr>
+          <w:lang w:eastAsia="ru-RU"/>
+        </w:rPr>
+        <w:t>Cache</w:t>
+      </w:r>
+      <w:proofErr w:type="spellEnd"/>
+      <w:r>
+        <w:rPr>
+          <w:lang w:eastAsia="ru-RU"/>
+        </w:rPr>
+        <w:t>: 1763.</w:t>
+      </w:r>
+      <w:r>
+        <w:rPr>
+          <w:lang w:eastAsia="ru-RU"/>
+        </w:rPr>
         <w:t>863</w:t>
       </w:r>
       <w:r>
         <w:rPr>
           <w:lang w:eastAsia="ru-RU"/>
         </w:rPr>
-        <w:t xml:space="preserve"> MiB</w:t>
-      </w:r>
+        <w:t xml:space="preserve"> </w:t>
+      </w:r>
+      <w:proofErr w:type="spellStart"/>
+      <w:r>
+        <w:rPr>
+          <w:lang w:eastAsia="ru-RU"/>
+        </w:rPr>
+        <w:t>MiB</w:t>
+      </w:r>
+      <w:proofErr w:type="spellEnd"/>
     </w:p>
     <w:p>
       <w:pPr>
@@ -4228,11 +4582,19 @@
           <w:lang w:eastAsia="ru-RU"/>
         </w:rPr>
       </w:pPr>
+      <w:proofErr w:type="spellStart"/>
       <w:r>
         <w:rPr>
           <w:lang w:eastAsia="ru-RU"/>
         </w:rPr>
-        <w:t>Swap:</w:t>
+        <w:t>Swap</w:t>
+      </w:r>
+      <w:proofErr w:type="spellEnd"/>
+      <w:r>
+        <w:rPr>
+          <w:lang w:eastAsia="ru-RU"/>
+        </w:rPr>
+        <w:t>:</w:t>
       </w:r>
     </w:p>
     <w:p>
@@ -4251,8 +4613,16 @@
         <w:rPr>
           <w:lang w:eastAsia="ru-RU"/>
         </w:rPr>
-        <w:t>Всего: 9999.996 MiB</w:t>
-      </w:r>
+        <w:t xml:space="preserve">Всего: 9999.996 </w:t>
+      </w:r>
+      <w:proofErr w:type="spellStart"/>
+      <w:r>
+        <w:rPr>
+          <w:lang w:eastAsia="ru-RU"/>
+        </w:rPr>
+        <w:t>MiB</w:t>
+      </w:r>
+      <w:proofErr w:type="spellEnd"/>
     </w:p>
     <w:p>
       <w:pPr>
@@ -4270,8 +4640,16 @@
         <w:rPr>
           <w:lang w:eastAsia="ru-RU"/>
         </w:rPr>
-        <w:t>Свободно: 9732.297 MiB</w:t>
-      </w:r>
+        <w:t xml:space="preserve">Свободно: 9732.297 </w:t>
+      </w:r>
+      <w:proofErr w:type="spellStart"/>
+      <w:r>
+        <w:rPr>
+          <w:lang w:eastAsia="ru-RU"/>
+        </w:rPr>
+        <w:t>MiB</w:t>
+      </w:r>
+      <w:proofErr w:type="spellEnd"/>
     </w:p>
     <w:p>
       <w:pPr>
@@ -4289,8 +4667,16 @@
         <w:rPr>
           <w:lang w:eastAsia="ru-RU"/>
         </w:rPr>
-        <w:t>Использовано: 267.699 MiB</w:t>
-      </w:r>
+        <w:t xml:space="preserve">Использовано: 267.699 </w:t>
+      </w:r>
+      <w:proofErr w:type="spellStart"/>
+      <w:r>
+        <w:rPr>
+          <w:lang w:eastAsia="ru-RU"/>
+        </w:rPr>
+        <w:t>MiB</w:t>
+      </w:r>
+      <w:proofErr w:type="spellEnd"/>
     </w:p>
     <w:p>
       <w:pPr>
@@ -4341,6 +4727,7 @@
         </w:rPr>
         <w:t>.</w:t>
       </w:r>
+      <w:proofErr w:type="spellStart"/>
       <w:r>
         <w:rPr>
           <w:b/>
@@ -4348,6 +4735,7 @@
         </w:rPr>
         <w:t>sh</w:t>
       </w:r>
+      <w:proofErr w:type="spellEnd"/>
       <w:r>
         <w:rPr>
           <w:b/>
@@ -4365,11 +4753,19 @@
           <w:lang w:val="en-US"/>
         </w:rPr>
       </w:pPr>
+      <w:proofErr w:type="gramStart"/>
       <w:r>
         <w:rPr>
           <w:lang w:val="en-US"/>
         </w:rPr>
-        <w:t xml:space="preserve">while true do </w:t>
+        <w:t>while</w:t>
+      </w:r>
+      <w:proofErr w:type="gramEnd"/>
+      <w:r>
+        <w:rPr>
+          <w:lang w:val="en-US"/>
+        </w:rPr>
+        <w:t xml:space="preserve"> true do </w:t>
       </w:r>
     </w:p>
     <w:p>
@@ -4380,13 +4776,24 @@
         </w:rPr>
       </w:pPr>
       <w:r>
+        <w:rPr>
+          <w:lang w:val="en-US"/>
+        </w:rPr>
         <w:t xml:space="preserve">  </w:t>
       </w:r>
+      <w:proofErr w:type="gramStart"/>
       <w:r>
         <w:rPr>
           <w:lang w:val="en-US"/>
         </w:rPr>
-        <w:t xml:space="preserve">true </w:t>
+        <w:t>true</w:t>
+      </w:r>
+      <w:proofErr w:type="gramEnd"/>
+      <w:r>
+        <w:rPr>
+          <w:lang w:val="en-US"/>
+        </w:rPr>
+        <w:t xml:space="preserve"> </w:t>
       </w:r>
     </w:p>
     <w:p>
@@ -4396,12 +4803,14 @@
           <w:lang w:val="en-US"/>
         </w:rPr>
       </w:pPr>
+      <w:proofErr w:type="gramStart"/>
       <w:r>
         <w:rPr>
           <w:lang w:val="en-US"/>
         </w:rPr>
         <w:t>done</w:t>
       </w:r>
+      <w:proofErr w:type="gramEnd"/>
     </w:p>
     <w:p>
       <w:pPr>
@@ -4414,9 +4823,36 @@
     <w:p>
       <w:pPr>
         <w:pStyle w:val="a6"/>
-      </w:pPr>
-      <w:r>
-        <w:t xml:space="preserve">Содержимое созданного файла </w:t>
+        <w:rPr>
+          <w:lang w:val="en-US"/>
+        </w:rPr>
+      </w:pPr>
+      <w:r>
+        <w:t>Содержимое</w:t>
+      </w:r>
+      <w:r>
+        <w:rPr>
+          <w:lang w:val="en-US"/>
+        </w:rPr>
+        <w:t xml:space="preserve"> </w:t>
+      </w:r>
+      <w:r>
+        <w:t>созданного</w:t>
+      </w:r>
+      <w:r>
+        <w:rPr>
+          <w:lang w:val="en-US"/>
+        </w:rPr>
+        <w:t xml:space="preserve"> </w:t>
+      </w:r>
+      <w:r>
+        <w:t>файла</w:t>
+      </w:r>
+      <w:r>
+        <w:rPr>
+          <w:lang w:val="en-US"/>
+        </w:rPr>
+        <w:t xml:space="preserve"> </w:t>
       </w:r>
       <w:r>
         <w:rPr>
@@ -4428,6 +4864,7 @@
       <w:r>
         <w:rPr>
           <w:b/>
+          <w:lang w:val="en-US"/>
         </w:rPr>
         <w:t>.</w:t>
       </w:r>
@@ -4439,6 +4876,9 @@
         <w:t>sh</w:t>
       </w:r>
       <w:r>
+        <w:rPr>
+          <w:lang w:val="en-US"/>
+        </w:rPr>
         <w:t>:</w:t>
       </w:r>
     </w:p>
@@ -4527,21 +4967,39 @@
       <w:r>
         <w:t xml:space="preserve">С помощью команды </w:t>
       </w:r>
+      <w:proofErr w:type="spellStart"/>
       <w:r>
         <w:rPr>
           <w:b/>
         </w:rPr>
-        <w:t>ps -efu</w:t>
-      </w:r>
+        <w:t>ps</w:t>
+      </w:r>
+      <w:proofErr w:type="spellEnd"/>
+      <w:r>
+        <w:rPr>
+          <w:b/>
+        </w:rPr>
+        <w:t xml:space="preserve"> -</w:t>
+      </w:r>
+      <w:proofErr w:type="spellStart"/>
+      <w:r>
+        <w:rPr>
+          <w:b/>
+        </w:rPr>
+        <w:t>efu</w:t>
+      </w:r>
+      <w:proofErr w:type="spellEnd"/>
       <w:r>
         <w:t xml:space="preserve"> посмотрите список Ваших активных процессов и занесите его в отчет. Посмотрите изменения в результатах, выводимых командой </w:t>
       </w:r>
+      <w:proofErr w:type="spellStart"/>
       <w:r>
         <w:rPr>
           <w:b/>
         </w:rPr>
         <w:t>top</w:t>
       </w:r>
+      <w:proofErr w:type="spellEnd"/>
       <w:r>
         <w:t xml:space="preserve"> в</w:t>
       </w:r>
@@ -4562,24 +5020,34 @@
       <w:r>
         <w:t xml:space="preserve">Скриншот вывода команды </w:t>
       </w:r>
+      <w:proofErr w:type="spellStart"/>
       <w:r>
         <w:rPr>
           <w:b/>
         </w:rPr>
-        <w:t xml:space="preserve">ps </w:t>
-      </w:r>
+        <w:t>ps</w:t>
+      </w:r>
+      <w:proofErr w:type="spellEnd"/>
       <w:r>
         <w:rPr>
           <w:b/>
         </w:rPr>
+        <w:t xml:space="preserve"> </w:t>
+      </w:r>
+      <w:r>
+        <w:rPr>
+          <w:b/>
+        </w:rPr>
         <w:t>-</w:t>
       </w:r>
+      <w:proofErr w:type="spellStart"/>
       <w:r>
         <w:rPr>
           <w:b/>
         </w:rPr>
         <w:t>efu</w:t>
       </w:r>
+      <w:proofErr w:type="spellEnd"/>
       <w:r>
         <w:t>:</w:t>
       </w:r>
@@ -4730,6 +5198,7 @@
         </w:rPr>
         <w:t>.</w:t>
       </w:r>
+      <w:proofErr w:type="spellStart"/>
       <w:r>
         <w:rPr>
           <w:b/>
@@ -4737,6 +5206,7 @@
         </w:rPr>
         <w:t>sh</w:t>
       </w:r>
+      <w:proofErr w:type="spellEnd"/>
       <w:r>
         <w:t xml:space="preserve"> </w:t>
       </w:r>
@@ -4794,11 +5264,19 @@
       <w:r>
         <w:t xml:space="preserve">Повторно запустите сценарий командой </w:t>
       </w:r>
+      <w:proofErr w:type="spellStart"/>
       <w:r>
         <w:rPr>
           <w:b/>
         </w:rPr>
-        <w:t>sh ./loop.sh &amp;</w:t>
+        <w:t>sh</w:t>
+      </w:r>
+      <w:proofErr w:type="spellEnd"/>
+      <w:r>
+        <w:rPr>
+          <w:b/>
+        </w:rPr>
+        <w:t xml:space="preserve"> ./loop.sh &amp;</w:t>
       </w:r>
       <w:r>
         <w:t>, посмотрите список Ваших активных процессов, сравните результаты с полученными в п.6 и занесите в отчет идентификаторы и имена новых процессов.</w:t>
@@ -4925,6 +5403,7 @@
       <w:r>
         <w:t xml:space="preserve"> с помощью команды </w:t>
       </w:r>
+      <w:proofErr w:type="spellStart"/>
       <w:r>
         <w:rPr>
           <w:b/>
@@ -4932,6 +5411,7 @@
         </w:rPr>
         <w:t>sh</w:t>
       </w:r>
+      <w:proofErr w:type="spellEnd"/>
       <w:r>
         <w:t xml:space="preserve">, в столбце </w:t>
       </w:r>
@@ -4972,12 +5452,14 @@
       <w:r>
         <w:t xml:space="preserve">Посмотрите изменения в результатах, выводимых командой </w:t>
       </w:r>
+      <w:proofErr w:type="spellStart"/>
       <w:r>
         <w:rPr>
           <w:b/>
         </w:rPr>
         <w:t>top</w:t>
       </w:r>
+      <w:proofErr w:type="spellEnd"/>
       <w:r>
         <w:t xml:space="preserve"> в втором окне.</w:t>
       </w:r>
@@ -5067,12 +5549,14 @@
       <w:r>
         <w:t xml:space="preserve">Выполните принудительное прерывание всех процессов, запущенных в п.5 и п.7 и убедитесь, что все процессы уничтожены. Прервите во втором окне выполнение команды </w:t>
       </w:r>
+      <w:proofErr w:type="spellStart"/>
       <w:r>
         <w:rPr>
           <w:b/>
         </w:rPr>
         <w:t>top</w:t>
       </w:r>
+      <w:proofErr w:type="spellEnd"/>
       <w:r>
         <w:t xml:space="preserve"> и закройте оба соединения.</w:t>
       </w:r>
@@ -5138,13 +5622,31 @@
       <w:r>
         <w:t xml:space="preserve">Вывод команды </w:t>
       </w:r>
+      <w:proofErr w:type="spellStart"/>
       <w:r>
         <w:rPr>
           <w:b/>
           <w:lang w:val="en-US"/>
         </w:rPr>
-        <w:t>ps -efu</w:t>
-      </w:r>
+        <w:t>ps</w:t>
+      </w:r>
+      <w:proofErr w:type="spellEnd"/>
+      <w:r>
+        <w:rPr>
+          <w:b/>
+          <w:lang w:val="en-US"/>
+        </w:rPr>
+        <w:t xml:space="preserve"> -</w:t>
+      </w:r>
+      <w:proofErr w:type="spellStart"/>
+      <w:r>
+        <w:rPr>
+          <w:b/>
+          <w:lang w:val="en-US"/>
+        </w:rPr>
+        <w:t>efu</w:t>
+      </w:r>
+      <w:proofErr w:type="spellEnd"/>
       <w:r>
         <w:rPr>
           <w:lang w:val="en-US"/>
@@ -5406,7 +5908,23 @@
         <w:pStyle w:val="a6"/>
       </w:pPr>
       <w:r>
-        <w:t>Создайте на облачной платформе НГТУ виртуальный сервер (ВС) с операционной системой Ubuntu Server и опубликуйте его для доступа из внешней сети по протоколу SSH. Имя сервера должно совпадать с Вашим бригадным логином, например, pmi-b0105. Внешний доступ к серверу будет проводиться по назначенному внешнему адресу и номеру порта, например, ssh.cloud.nstu.ru:5080.</w:t>
+        <w:t xml:space="preserve">Создайте на облачной платформе НГТУ виртуальный сервер (ВС) с операционной системой </w:t>
+      </w:r>
+      <w:proofErr w:type="spellStart"/>
+      <w:r>
+        <w:t>Ubuntu</w:t>
+      </w:r>
+      <w:proofErr w:type="spellEnd"/>
+      <w:r>
+        <w:t xml:space="preserve"> </w:t>
+      </w:r>
+      <w:proofErr w:type="spellStart"/>
+      <w:r>
+        <w:t>Server</w:t>
+      </w:r>
+      <w:proofErr w:type="spellEnd"/>
+      <w:r>
+        <w:t xml:space="preserve"> и опубликуйте его для доступа из внешней сети по протоколу SSH. Имя сервера должно совпадать с Вашим бригадным логином, например, pmi-b0105. Внешний доступ к серверу будет проводиться по назначенному внешнему адресу и номеру порта, например, ssh.cloud.nstu.ru:5080.</w:t>
       </w:r>
     </w:p>
     <w:p>
@@ -5416,12 +5934,14 @@
       <w:r>
         <w:t xml:space="preserve">Будем использовать </w:t>
       </w:r>
+      <w:proofErr w:type="spellStart"/>
       <w:r>
         <w:rPr>
           <w:lang w:val="en-US"/>
         </w:rPr>
         <w:t>Xubuntu</w:t>
       </w:r>
+      <w:proofErr w:type="spellEnd"/>
       <w:r>
         <w:t xml:space="preserve"> 21.10.</w:t>
       </w:r>
@@ -5512,6 +6032,10 @@
         <w:pStyle w:val="a6"/>
       </w:pPr>
       <w:r>
+        <w:rPr>
+          <w:noProof/>
+          <w:lang w:eastAsia="ru-RU"/>
+        </w:rPr>
         <w:drawing>
           <wp:inline distT="0" distB="0" distL="0" distR="0" wp14:anchorId="67B4417D" wp14:editId="463B0B8A">
             <wp:extent cx="5334744" cy="1933845"/>
@@ -5619,9 +6143,23 @@
       </w:pPr>
       <w:r>
         <w:tab/>
-      </w:r>
-      <w:r>
-        <w:t>Подключитесь к ВС через консоль. Запустите эмулятор терминала (кнопка Applications Menu в левом верхнем углу окна консоли), выполните п.1 – п.3 первого этапа задания и сравните структуры файловых систем ВС и сервера ФПМИ.</w:t>
+        <w:t xml:space="preserve">Подключитесь к ВС через консоль. Запустите эмулятор терминала (кнопка </w:t>
+      </w:r>
+      <w:proofErr w:type="spellStart"/>
+      <w:r>
+        <w:t>Applications</w:t>
+      </w:r>
+      <w:proofErr w:type="spellEnd"/>
+      <w:r>
+        <w:t xml:space="preserve"> </w:t>
+      </w:r>
+      <w:proofErr w:type="spellStart"/>
+      <w:r>
+        <w:t>Menu</w:t>
+      </w:r>
+      <w:proofErr w:type="spellEnd"/>
+      <w:r>
+        <w:t xml:space="preserve"> в левом верхнем углу окна консоли), выполните п.1 – п.3 первого этапа задания и сравните структуры файловых систем ВС и сервера ФПМИ.</w:t>
       </w:r>
     </w:p>
     <w:p>
@@ -5647,8 +6185,30 @@
         <w:rPr>
           <w:b/>
         </w:rPr>
-        <w:t>/proc/partitions</w:t>
-      </w:r>
+        <w:t>/</w:t>
+      </w:r>
+      <w:proofErr w:type="spellStart"/>
+      <w:r>
+        <w:rPr>
+          <w:b/>
+        </w:rPr>
+        <w:t>proc</w:t>
+      </w:r>
+      <w:proofErr w:type="spellEnd"/>
+      <w:r>
+        <w:rPr>
+          <w:b/>
+        </w:rPr>
+        <w:t>/</w:t>
+      </w:r>
+      <w:proofErr w:type="spellStart"/>
+      <w:r>
+        <w:rPr>
+          <w:b/>
+        </w:rPr>
+        <w:t>partitions</w:t>
+      </w:r>
+      <w:proofErr w:type="spellEnd"/>
       <w:r>
         <w:t>, определите количество разделов в файловой системе сервера и количество драйверов, управляющих этими разделами.</w:t>
       </w:r>
@@ -5664,8 +6224,30 @@
         <w:rPr>
           <w:b/>
         </w:rPr>
-        <w:t>/proc/partitions</w:t>
-      </w:r>
+        <w:t>/</w:t>
+      </w:r>
+      <w:proofErr w:type="spellStart"/>
+      <w:r>
+        <w:rPr>
+          <w:b/>
+        </w:rPr>
+        <w:t>proc</w:t>
+      </w:r>
+      <w:proofErr w:type="spellEnd"/>
+      <w:r>
+        <w:rPr>
+          <w:b/>
+        </w:rPr>
+        <w:t>/</w:t>
+      </w:r>
+      <w:proofErr w:type="spellStart"/>
+      <w:r>
+        <w:rPr>
+          <w:b/>
+        </w:rPr>
+        <w:t>partitions</w:t>
+      </w:r>
+      <w:proofErr w:type="spellEnd"/>
       <w:r>
         <w:t>:</w:t>
       </w:r>
@@ -5757,33 +6339,39 @@
       <w:r>
         <w:t xml:space="preserve"> (</w:t>
       </w:r>
+      <w:proofErr w:type="spellStart"/>
       <w:r>
         <w:rPr>
           <w:lang w:val="en-US"/>
         </w:rPr>
         <w:t>sda</w:t>
       </w:r>
+      <w:proofErr w:type="spellEnd"/>
       <w:r>
         <w:t xml:space="preserve">1, </w:t>
       </w:r>
+      <w:proofErr w:type="spellStart"/>
       <w:r>
         <w:rPr>
           <w:lang w:val="en-US"/>
         </w:rPr>
         <w:t>sda</w:t>
       </w:r>
+      <w:proofErr w:type="spellEnd"/>
       <w:r>
         <w:t>2,</w:t>
       </w:r>
       <w:r>
         <w:t xml:space="preserve"> </w:t>
       </w:r>
+      <w:proofErr w:type="spellStart"/>
       <w:r>
         <w:rPr>
           <w:lang w:val="en-US"/>
         </w:rPr>
         <w:t>sda</w:t>
       </w:r>
+      <w:proofErr w:type="spellEnd"/>
       <w:r>
         <w:t>3</w:t>
       </w:r>
@@ -5814,24 +6402,28 @@
       <w:r>
         <w:t xml:space="preserve"> (</w:t>
       </w:r>
+      <w:proofErr w:type="spellStart"/>
       <w:r>
         <w:rPr>
           <w:lang w:val="en-US"/>
         </w:rPr>
         <w:t>dm</w:t>
       </w:r>
+      <w:proofErr w:type="spellEnd"/>
       <w:r>
         <w:t>-0</w:t>
       </w:r>
       <w:r>
         <w:t xml:space="preserve">, </w:t>
       </w:r>
+      <w:proofErr w:type="spellStart"/>
       <w:r>
         <w:rPr>
           <w:lang w:val="en-US"/>
         </w:rPr>
         <w:t>dm</w:t>
       </w:r>
+      <w:proofErr w:type="spellEnd"/>
       <w:r>
         <w:t>-1</w:t>
       </w:r>
@@ -5889,7 +6481,23 @@
         <w:pStyle w:val="a6"/>
       </w:pPr>
       <w:r>
-        <w:t>С помощью команд lsblk и df определите основные характеристики разделов внешней памяти сервера (имя и номер устройства, имя и тип раздела, размер, тип файловой системы, коэффициент использования памяти) и сравните их с результатами п.2. Результаты представьте в виде следующей таблицы</w:t>
+        <w:t xml:space="preserve">С помощью команд </w:t>
+      </w:r>
+      <w:proofErr w:type="spellStart"/>
+      <w:r>
+        <w:t>lsblk</w:t>
+      </w:r>
+      <w:proofErr w:type="spellEnd"/>
+      <w:r>
+        <w:t xml:space="preserve"> и </w:t>
+      </w:r>
+      <w:proofErr w:type="spellStart"/>
+      <w:r>
+        <w:t>df</w:t>
+      </w:r>
+      <w:proofErr w:type="spellEnd"/>
+      <w:r>
+        <w:t xml:space="preserve"> определите основные характеристики разделов внешней памяти сервера (имя и номер устройства, имя и тип раздела, размер, тип файловой системы, коэффициент использования памяти) и сравните их с результатами п.2. Результаты представьте в виде следующей таблицы</w:t>
       </w:r>
       <w:r>
         <w:t>.</w:t>
@@ -5902,11 +6510,33 @@
       <w:r>
         <w:t xml:space="preserve">Используя команду </w:t>
       </w:r>
+      <w:proofErr w:type="spellStart"/>
       <w:r>
         <w:rPr>
           <w:b/>
         </w:rPr>
-        <w:t>lsblk -o NAME,KNAME,MAJ:MIN,FSTYPE,SIZE</w:t>
+        <w:t>lsblk</w:t>
+      </w:r>
+      <w:proofErr w:type="spellEnd"/>
+      <w:r>
+        <w:rPr>
+          <w:b/>
+        </w:rPr>
+        <w:t xml:space="preserve"> -o </w:t>
+      </w:r>
+      <w:proofErr w:type="gramStart"/>
+      <w:r>
+        <w:rPr>
+          <w:b/>
+        </w:rPr>
+        <w:t>NAME,KNAME</w:t>
+      </w:r>
+      <w:proofErr w:type="gramEnd"/>
+      <w:r>
+        <w:rPr>
+          <w:b/>
+        </w:rPr>
+        <w:t>,MAJ:MIN,FSTYPE,SIZE</w:t>
       </w:r>
       <w:r>
         <w:t xml:space="preserve">, </w:t>
@@ -5965,24 +6595,34 @@
       <w:r>
         <w:t xml:space="preserve">Используя команду </w:t>
       </w:r>
+      <w:proofErr w:type="spellStart"/>
       <w:r>
         <w:rPr>
           <w:b/>
         </w:rPr>
-        <w:t xml:space="preserve">df </w:t>
-      </w:r>
+        <w:t>df</w:t>
+      </w:r>
+      <w:proofErr w:type="spellEnd"/>
       <w:r>
         <w:rPr>
           <w:b/>
         </w:rPr>
+        <w:t xml:space="preserve"> </w:t>
+      </w:r>
+      <w:r>
+        <w:rPr>
+          <w:b/>
+        </w:rPr>
         <w:t>-</w:t>
       </w:r>
+      <w:proofErr w:type="spellStart"/>
       <w:r>
         <w:rPr>
           <w:b/>
         </w:rPr>
         <w:t>hT</w:t>
       </w:r>
+      <w:proofErr w:type="spellEnd"/>
       <w:r>
         <w:t xml:space="preserve"> (опция -</w:t>
       </w:r>
@@ -6264,6 +6904,7 @@
                 <w:lang w:val="en-US"/>
               </w:rPr>
             </w:pPr>
+            <w:proofErr w:type="spellStart"/>
             <w:r>
               <w:rPr>
                 <w:sz w:val="24"/>
@@ -6271,6 +6912,7 @@
               </w:rPr>
               <w:t>sda</w:t>
             </w:r>
+            <w:proofErr w:type="spellEnd"/>
           </w:p>
         </w:tc>
         <w:tc>
@@ -6427,6 +7069,7 @@
                 <w:lang w:val="en-US"/>
               </w:rPr>
             </w:pPr>
+            <w:proofErr w:type="spellStart"/>
             <w:r>
               <w:rPr>
                 <w:sz w:val="24"/>
@@ -6434,6 +7077,7 @@
               </w:rPr>
               <w:t>sda</w:t>
             </w:r>
+            <w:proofErr w:type="spellEnd"/>
           </w:p>
         </w:tc>
         <w:tc>
@@ -6509,6 +7153,7 @@
                 <w:lang w:val="en-US"/>
               </w:rPr>
             </w:pPr>
+            <w:proofErr w:type="spellStart"/>
             <w:r>
               <w:rPr>
                 <w:sz w:val="24"/>
@@ -6516,6 +7161,7 @@
               </w:rPr>
               <w:t>vfat</w:t>
             </w:r>
+            <w:proofErr w:type="spellEnd"/>
           </w:p>
         </w:tc>
         <w:tc>
@@ -6597,6 +7243,7 @@
                 <w:lang w:val="en-US"/>
               </w:rPr>
             </w:pPr>
+            <w:proofErr w:type="spellStart"/>
             <w:r>
               <w:rPr>
                 <w:sz w:val="24"/>
@@ -6604,6 +7251,7 @@
               </w:rPr>
               <w:t>sda</w:t>
             </w:r>
+            <w:proofErr w:type="spellEnd"/>
           </w:p>
         </w:tc>
         <w:tc>
@@ -6767,6 +7415,7 @@
                 <w:lang w:val="en-US"/>
               </w:rPr>
             </w:pPr>
+            <w:proofErr w:type="spellStart"/>
             <w:r>
               <w:rPr>
                 <w:sz w:val="24"/>
@@ -6774,6 +7423,7 @@
               </w:rPr>
               <w:t>sda</w:t>
             </w:r>
+            <w:proofErr w:type="spellEnd"/>
           </w:p>
         </w:tc>
         <w:tc>
@@ -6788,19 +7438,21 @@
                 <w:lang w:val="en-US"/>
               </w:rPr>
             </w:pPr>
-            <w:r>
-              <w:rPr>
-                <w:sz w:val="24"/>
-                <w:lang w:val="en-US"/>
-              </w:rPr>
-              <w:t>v</w:t>
-            </w:r>
-            <w:r>
-              <w:rPr>
-                <w:sz w:val="24"/>
-                <w:lang w:val="en-US"/>
-              </w:rPr>
-              <w:t>gxubuntu-root</w:t>
+            <w:proofErr w:type="spellStart"/>
+            <w:r>
+              <w:rPr>
+                <w:sz w:val="24"/>
+                <w:lang w:val="en-US"/>
+              </w:rPr>
+              <w:t>vgxubuntu</w:t>
+            </w:r>
+            <w:proofErr w:type="spellEnd"/>
+            <w:r>
+              <w:rPr>
+                <w:sz w:val="24"/>
+                <w:lang w:val="en-US"/>
+              </w:rPr>
+              <w:t>-root</w:t>
             </w:r>
           </w:p>
         </w:tc>
@@ -6951,6 +7603,7 @@
                 <w:lang w:val="en-US"/>
               </w:rPr>
             </w:pPr>
+            <w:proofErr w:type="spellStart"/>
             <w:r>
               <w:rPr>
                 <w:sz w:val="24"/>
@@ -6958,6 +7611,7 @@
               </w:rPr>
               <w:t>sda</w:t>
             </w:r>
+            <w:proofErr w:type="spellEnd"/>
           </w:p>
         </w:tc>
         <w:tc>
@@ -6977,14 +7631,7 @@
                 <w:sz w:val="24"/>
                 <w:lang w:val="en-US"/>
               </w:rPr>
-              <w:t>v</w:t>
-            </w:r>
-            <w:r>
-              <w:rPr>
-                <w:sz w:val="24"/>
-                <w:lang w:val="en-US"/>
-              </w:rPr>
-              <w:t>gxubuntu-swap_1</w:t>
+              <w:t>vgxubuntu-swap_1</w:t>
             </w:r>
           </w:p>
         </w:tc>
@@ -7298,21 +7945,25 @@
       <w:r>
         <w:t xml:space="preserve">С помощью команд </w:t>
       </w:r>
+      <w:proofErr w:type="spellStart"/>
       <w:r>
         <w:rPr>
           <w:b/>
         </w:rPr>
         <w:t>df</w:t>
       </w:r>
+      <w:proofErr w:type="spellEnd"/>
       <w:r>
         <w:t xml:space="preserve"> и </w:t>
       </w:r>
+      <w:proofErr w:type="spellStart"/>
       <w:r>
         <w:rPr>
           <w:b/>
         </w:rPr>
         <w:t>du</w:t>
       </w:r>
+      <w:proofErr w:type="spellEnd"/>
       <w:r>
         <w:t xml:space="preserve"> определите типы файловых систем, используемых на сервере, а также в каком из имеющихся разделов расположен ваш домашний каталог и размер домашнего каталога. Поясните назначение каждой из файловых систем.</w:t>
       </w:r>
@@ -7384,7 +8035,21 @@
         <w:rPr>
           <w:szCs w:val="28"/>
         </w:rPr>
-        <w:t>– основная файловая система в Linux. В нашем случае применяется для</w:t>
+        <w:t xml:space="preserve">– основная файловая система в </w:t>
+      </w:r>
+      <w:proofErr w:type="spellStart"/>
+      <w:r>
+        <w:rPr>
+          <w:szCs w:val="28"/>
+        </w:rPr>
+        <w:t>Linux</w:t>
+      </w:r>
+      <w:proofErr w:type="spellEnd"/>
+      <w:r>
+        <w:rPr>
+          <w:szCs w:val="28"/>
+        </w:rPr>
+        <w:t>. В нашем случае применяется для</w:t>
       </w:r>
       <w:r>
         <w:rPr>
@@ -7411,16 +8076,31 @@
         <w:rPr>
           <w:szCs w:val="28"/>
         </w:rPr>
-        <w:t>. Надёжна и поддерживает журналирование.</w:t>
-      </w:r>
-    </w:p>
-    <w:p>
-      <w:pPr>
-        <w:pStyle w:val="a6"/>
+        <w:t xml:space="preserve">. Надёжна и поддерживает </w:t>
+      </w:r>
+      <w:proofErr w:type="spellStart"/>
+      <w:r>
         <w:rPr>
           <w:szCs w:val="28"/>
         </w:rPr>
-      </w:pPr>
+        <w:t>журналирование</w:t>
+      </w:r>
+      <w:proofErr w:type="spellEnd"/>
+      <w:r>
+        <w:rPr>
+          <w:szCs w:val="28"/>
+        </w:rPr>
+        <w:t>.</w:t>
+      </w:r>
+    </w:p>
+    <w:p>
+      <w:pPr>
+        <w:pStyle w:val="a6"/>
+        <w:rPr>
+          <w:szCs w:val="28"/>
+        </w:rPr>
+      </w:pPr>
+      <w:proofErr w:type="spellStart"/>
       <w:r>
         <w:rPr>
           <w:rStyle w:val="ab"/>
@@ -7428,6 +8108,7 @@
         </w:rPr>
         <w:t>tmpfs</w:t>
       </w:r>
+      <w:proofErr w:type="spellEnd"/>
       <w:r>
         <w:rPr>
           <w:szCs w:val="28"/>
@@ -7442,6 +8123,7 @@
           <w:szCs w:val="28"/>
         </w:rPr>
       </w:pPr>
+      <w:proofErr w:type="spellStart"/>
       <w:r>
         <w:rPr>
           <w:b/>
@@ -7449,11 +8131,40 @@
         </w:rPr>
         <w:t>vfat</w:t>
       </w:r>
+      <w:proofErr w:type="spellEnd"/>
       <w:r>
         <w:rPr>
           <w:szCs w:val="28"/>
         </w:rPr>
-        <w:t xml:space="preserve"> – файловая система, которая представляет собой расширенную версию FAT, поддерживающую длинные имена файлов. Применяется в основном для носителей, используемых для обмена данными между Windows и Linux.</w:t>
+        <w:t xml:space="preserve"> – файловая система, которая представляет собой расширенную версию FAT, поддерживающую длинные имена файлов. Применяется в основном для носителей, используемых для обмена данными между </w:t>
+      </w:r>
+      <w:proofErr w:type="spellStart"/>
+      <w:r>
+        <w:rPr>
+          <w:szCs w:val="28"/>
+        </w:rPr>
+        <w:t>Windows</w:t>
+      </w:r>
+      <w:proofErr w:type="spellEnd"/>
+      <w:r>
+        <w:rPr>
+          <w:szCs w:val="28"/>
+        </w:rPr>
+        <w:t xml:space="preserve"> и </w:t>
+      </w:r>
+      <w:proofErr w:type="spellStart"/>
+      <w:r>
+        <w:rPr>
+          <w:szCs w:val="28"/>
+        </w:rPr>
+        <w:t>Linux</w:t>
+      </w:r>
+      <w:proofErr w:type="spellEnd"/>
+      <w:r>
+        <w:rPr>
+          <w:szCs w:val="28"/>
+        </w:rPr>
+        <w:t>.</w:t>
       </w:r>
     </w:p>
     <w:p>
@@ -7476,8 +8187,59 @@
           <w:bCs/>
           <w:lang w:eastAsia="ru-RU"/>
         </w:rPr>
-        <w:t>/dev/mapper/vgxubuntu-root</w:t>
-      </w:r>
+        <w:t>/</w:t>
+      </w:r>
+      <w:proofErr w:type="spellStart"/>
+      <w:r>
+        <w:rPr>
+          <w:rFonts w:eastAsia="Times New Roman"/>
+          <w:b/>
+          <w:bCs/>
+          <w:lang w:eastAsia="ru-RU"/>
+        </w:rPr>
+        <w:t>dev</w:t>
+      </w:r>
+      <w:proofErr w:type="spellEnd"/>
+      <w:r>
+        <w:rPr>
+          <w:rFonts w:eastAsia="Times New Roman"/>
+          <w:b/>
+          <w:bCs/>
+          <w:lang w:eastAsia="ru-RU"/>
+        </w:rPr>
+        <w:t>/</w:t>
+      </w:r>
+      <w:proofErr w:type="spellStart"/>
+      <w:r>
+        <w:rPr>
+          <w:rFonts w:eastAsia="Times New Roman"/>
+          <w:b/>
+          <w:bCs/>
+          <w:lang w:eastAsia="ru-RU"/>
+        </w:rPr>
+        <w:t>mapper</w:t>
+      </w:r>
+      <w:proofErr w:type="spellEnd"/>
+      <w:r>
+        <w:rPr>
+          <w:rFonts w:eastAsia="Times New Roman"/>
+          <w:b/>
+          <w:bCs/>
+          <w:lang w:eastAsia="ru-RU"/>
+        </w:rPr>
+        <w:t>/</w:t>
+      </w:r>
+      <w:proofErr w:type="spellStart"/>
+      <w:r>
+        <w:rPr>
+          <w:rFonts w:eastAsia="Times New Roman"/>
+          <w:b/>
+          <w:bCs/>
+          <w:lang w:eastAsia="ru-RU"/>
+        </w:rPr>
+        <w:t>vgxubuntu-root</w:t>
+      </w:r>
+      <w:proofErr w:type="spellEnd"/>
       <w:r>
         <w:rPr>
           <w:szCs w:val="28"/>
@@ -7617,16 +8379,190 @@
         <w:pStyle w:val="a6"/>
       </w:pPr>
       <w:r>
-        <w:t xml:space="preserve">Просмотрите структуру суперблока файловой системы ВС с помощью команды </w:t>
-      </w:r>
+        <w:t xml:space="preserve">Просмотрите структуру </w:t>
+      </w:r>
+      <w:proofErr w:type="spellStart"/>
+      <w:r>
+        <w:t>суперблока</w:t>
+      </w:r>
+      <w:proofErr w:type="spellEnd"/>
+      <w:r>
+        <w:t xml:space="preserve"> файловой системы ВС с помощью команды </w:t>
+      </w:r>
+      <w:proofErr w:type="spellStart"/>
       <w:r>
         <w:rPr>
           <w:b/>
         </w:rPr>
-        <w:t>sudo tune2fs –l /dev/dm-0</w:t>
-      </w:r>
-      <w:r>
-        <w:t>. Определите размеры дескриптора и блока (inode size, block size), общее число дескрипторов и блоков (inode count, block count), число свободных дескрипторов и блоков (free inodes, free blocks), число дескрипторов и блоков в группе (inodes per group, blocks per group). Здесь dm-0 – раздел файловой системы, в котором хранится домашний каталог.</w:t>
+        <w:t>sudo</w:t>
+      </w:r>
+      <w:proofErr w:type="spellEnd"/>
+      <w:r>
+        <w:rPr>
+          <w:b/>
+        </w:rPr>
+        <w:t xml:space="preserve"> tune2fs –l /</w:t>
+      </w:r>
+      <w:proofErr w:type="spellStart"/>
+      <w:r>
+        <w:rPr>
+          <w:b/>
+        </w:rPr>
+        <w:t>dev</w:t>
+      </w:r>
+      <w:proofErr w:type="spellEnd"/>
+      <w:r>
+        <w:rPr>
+          <w:b/>
+        </w:rPr>
+        <w:t>/dm-0</w:t>
+      </w:r>
+      <w:r>
+        <w:t>. Определите размеры дескриптора и блока (</w:t>
+      </w:r>
+      <w:proofErr w:type="spellStart"/>
+      <w:r>
+        <w:t>inode</w:t>
+      </w:r>
+      <w:proofErr w:type="spellEnd"/>
+      <w:r>
+        <w:t xml:space="preserve"> </w:t>
+      </w:r>
+      <w:proofErr w:type="spellStart"/>
+      <w:r>
+        <w:t>size</w:t>
+      </w:r>
+      <w:proofErr w:type="spellEnd"/>
+      <w:r>
+        <w:t xml:space="preserve">, </w:t>
+      </w:r>
+      <w:proofErr w:type="spellStart"/>
+      <w:r>
+        <w:t>block</w:t>
+      </w:r>
+      <w:proofErr w:type="spellEnd"/>
+      <w:r>
+        <w:t xml:space="preserve"> </w:t>
+      </w:r>
+      <w:proofErr w:type="spellStart"/>
+      <w:r>
+        <w:t>size</w:t>
+      </w:r>
+      <w:proofErr w:type="spellEnd"/>
+      <w:r>
+        <w:t>), общее число дескрипторов и блоков (</w:t>
+      </w:r>
+      <w:proofErr w:type="spellStart"/>
+      <w:r>
+        <w:t>inode</w:t>
+      </w:r>
+      <w:proofErr w:type="spellEnd"/>
+      <w:r>
+        <w:t xml:space="preserve"> </w:t>
+      </w:r>
+      <w:proofErr w:type="spellStart"/>
+      <w:r>
+        <w:t>count</w:t>
+      </w:r>
+      <w:proofErr w:type="spellEnd"/>
+      <w:r>
+        <w:t xml:space="preserve">, </w:t>
+      </w:r>
+      <w:proofErr w:type="spellStart"/>
+      <w:r>
+        <w:t>block</w:t>
+      </w:r>
+      <w:proofErr w:type="spellEnd"/>
+      <w:r>
+        <w:t xml:space="preserve"> </w:t>
+      </w:r>
+      <w:proofErr w:type="spellStart"/>
+      <w:r>
+        <w:t>count</w:t>
+      </w:r>
+      <w:proofErr w:type="spellEnd"/>
+      <w:r>
+        <w:t>), число свободных дескрипторов и блоков (</w:t>
+      </w:r>
+      <w:proofErr w:type="spellStart"/>
+      <w:r>
+        <w:t>free</w:t>
+      </w:r>
+      <w:proofErr w:type="spellEnd"/>
+      <w:r>
+        <w:t xml:space="preserve"> </w:t>
+      </w:r>
+      <w:proofErr w:type="spellStart"/>
+      <w:r>
+        <w:t>inodes</w:t>
+      </w:r>
+      <w:proofErr w:type="spellEnd"/>
+      <w:r>
+        <w:t xml:space="preserve">, </w:t>
+      </w:r>
+      <w:proofErr w:type="spellStart"/>
+      <w:r>
+        <w:t>free</w:t>
+      </w:r>
+      <w:proofErr w:type="spellEnd"/>
+      <w:r>
+        <w:t xml:space="preserve"> </w:t>
+      </w:r>
+      <w:proofErr w:type="spellStart"/>
+      <w:r>
+        <w:t>blocks</w:t>
+      </w:r>
+      <w:proofErr w:type="spellEnd"/>
+      <w:r>
+        <w:t>), число дескрипторов и блоков в группе (</w:t>
+      </w:r>
+      <w:proofErr w:type="spellStart"/>
+      <w:r>
+        <w:t>inodes</w:t>
+      </w:r>
+      <w:proofErr w:type="spellEnd"/>
+      <w:r>
+        <w:t xml:space="preserve"> </w:t>
+      </w:r>
+      <w:proofErr w:type="spellStart"/>
+      <w:r>
+        <w:t>per</w:t>
+      </w:r>
+      <w:proofErr w:type="spellEnd"/>
+      <w:r>
+        <w:t xml:space="preserve"> </w:t>
+      </w:r>
+      <w:proofErr w:type="spellStart"/>
+      <w:r>
+        <w:t>group</w:t>
+      </w:r>
+      <w:proofErr w:type="spellEnd"/>
+      <w:r>
+        <w:t xml:space="preserve">, </w:t>
+      </w:r>
+      <w:proofErr w:type="spellStart"/>
+      <w:r>
+        <w:t>blocks</w:t>
+      </w:r>
+      <w:proofErr w:type="spellEnd"/>
+      <w:r>
+        <w:t xml:space="preserve"> </w:t>
+      </w:r>
+      <w:proofErr w:type="spellStart"/>
+      <w:r>
+        <w:t>per</w:t>
+      </w:r>
+      <w:proofErr w:type="spellEnd"/>
+      <w:r>
+        <w:t xml:space="preserve"> </w:t>
+      </w:r>
+      <w:proofErr w:type="spellStart"/>
+      <w:r>
+        <w:t>group</w:t>
+      </w:r>
+      <w:proofErr w:type="spellEnd"/>
+      <w:r>
+        <w:t>). Здесь dm-0 – раздел файловой системы, в котором хранится домашний каталог.</w:t>
       </w:r>
     </w:p>
     <w:p>
@@ -7732,8 +8668,21 @@
         <w:t xml:space="preserve"> </w:t>
       </w:r>
       <w:r>
-        <w:t>(inode size</w:t>
-      </w:r>
+        <w:t>(</w:t>
+      </w:r>
+      <w:proofErr w:type="spellStart"/>
+      <w:r>
+        <w:t>inode</w:t>
+      </w:r>
+      <w:proofErr w:type="spellEnd"/>
+      <w:r>
+        <w:t xml:space="preserve"> </w:t>
+      </w:r>
+      <w:proofErr w:type="spellStart"/>
+      <w:r>
+        <w:t>size</w:t>
+      </w:r>
+      <w:proofErr w:type="spellEnd"/>
       <w:r>
         <w:t>)</w:t>
       </w:r>
@@ -7766,9 +8715,11 @@
       <w:r>
         <w:t xml:space="preserve"> </w:t>
       </w:r>
+      <w:proofErr w:type="spellStart"/>
       <w:r>
         <w:t>size</w:t>
       </w:r>
+      <w:proofErr w:type="spellEnd"/>
       <w:r>
         <w:t>)</w:t>
       </w:r>
@@ -7801,9 +8752,19 @@
       <w:r>
         <w:t xml:space="preserve"> (</w:t>
       </w:r>
-      <w:r>
-        <w:t>inode count</w:t>
-      </w:r>
+      <w:proofErr w:type="spellStart"/>
+      <w:r>
+        <w:t>inode</w:t>
+      </w:r>
+      <w:proofErr w:type="spellEnd"/>
+      <w:r>
+        <w:t xml:space="preserve"> </w:t>
+      </w:r>
+      <w:proofErr w:type="spellStart"/>
+      <w:r>
+        <w:t>count</w:t>
+      </w:r>
+      <w:proofErr w:type="spellEnd"/>
       <w:r>
         <w:t>)</w:t>
       </w:r>
@@ -7837,8 +8798,13 @@
         <w:t>block</w:t>
       </w:r>
       <w:r>
-        <w:t xml:space="preserve"> count</w:t>
-      </w:r>
+        <w:t xml:space="preserve"> </w:t>
+      </w:r>
+      <w:proofErr w:type="spellStart"/>
+      <w:r>
+        <w:t>count</w:t>
+      </w:r>
+      <w:proofErr w:type="spellEnd"/>
       <w:r>
         <w:t>)</w:t>
       </w:r>
@@ -7889,12 +8855,14 @@
       <w:r>
         <w:t xml:space="preserve"> </w:t>
       </w:r>
+      <w:proofErr w:type="spellStart"/>
       <w:r>
         <w:rPr>
           <w:lang w:val="en-US"/>
         </w:rPr>
         <w:t>inodes</w:t>
       </w:r>
+      <w:proofErr w:type="spellEnd"/>
       <w:r>
         <w:t>):</w:t>
       </w:r>
@@ -7910,46 +8878,106 @@
         <w:pStyle w:val="a6"/>
       </w:pPr>
       <w:r>
-        <w:t>Общее число</w:t>
-      </w:r>
+        <w:t>Общее число свободных блоков</w:t>
+      </w:r>
+      <w:r>
+        <w:t xml:space="preserve"> (</w:t>
+      </w:r>
+      <w:proofErr w:type="spellStart"/>
+      <w:r>
+        <w:t>free</w:t>
+      </w:r>
+      <w:proofErr w:type="spellEnd"/>
       <w:r>
         <w:t xml:space="preserve"> </w:t>
       </w:r>
-      <w:r>
-        <w:t>свободных блоков</w:t>
+      <w:proofErr w:type="spellStart"/>
+      <w:r>
+        <w:t>blocks</w:t>
+      </w:r>
+      <w:proofErr w:type="spellEnd"/>
+      <w:r>
+        <w:t>)</w:t>
+      </w:r>
+      <w:r>
+        <w:t>: 2909</w:t>
+      </w:r>
+      <w:r>
+        <w:t>469</w:t>
+      </w:r>
+    </w:p>
+    <w:p>
+      <w:pPr>
+        <w:pStyle w:val="a6"/>
+      </w:pPr>
+      <w:r>
+        <w:t>Число дескрипторов в группе</w:t>
       </w:r>
       <w:r>
         <w:t xml:space="preserve"> (</w:t>
       </w:r>
-      <w:r>
-        <w:t>free blocks</w:t>
-      </w:r>
+      <w:proofErr w:type="spellStart"/>
+      <w:r>
+        <w:t>inodes</w:t>
+      </w:r>
+      <w:proofErr w:type="spellEnd"/>
+      <w:r>
+        <w:t xml:space="preserve"> </w:t>
+      </w:r>
+      <w:proofErr w:type="spellStart"/>
+      <w:r>
+        <w:t>per</w:t>
+      </w:r>
+      <w:proofErr w:type="spellEnd"/>
+      <w:r>
+        <w:t xml:space="preserve"> </w:t>
+      </w:r>
+      <w:proofErr w:type="spellStart"/>
+      <w:r>
+        <w:t>group</w:t>
+      </w:r>
+      <w:proofErr w:type="spellEnd"/>
       <w:r>
         <w:t>)</w:t>
       </w:r>
       <w:r>
-        <w:t>: 2909</w:t>
-      </w:r>
-      <w:r>
-        <w:t>469</w:t>
-      </w:r>
-    </w:p>
-    <w:p>
-      <w:pPr>
-        <w:pStyle w:val="a6"/>
-      </w:pPr>
-      <w:r>
-        <w:t>Ч</w:t>
-      </w:r>
-      <w:r>
-        <w:t>исло дескрипторов в группе</w:t>
+        <w:t>:</w:t>
+      </w:r>
+      <w:r>
+        <w:t xml:space="preserve"> 8144</w:t>
+      </w:r>
+    </w:p>
+    <w:p>
+      <w:pPr>
+        <w:pStyle w:val="a6"/>
+      </w:pPr>
+      <w:r>
+        <w:t>Число блоков в группе</w:t>
       </w:r>
       <w:r>
         <w:t xml:space="preserve"> (</w:t>
       </w:r>
-      <w:r>
-        <w:t>inodes per group</w:t>
-      </w:r>
+      <w:proofErr w:type="spellStart"/>
+      <w:r>
+        <w:t>blocks</w:t>
+      </w:r>
+      <w:proofErr w:type="spellEnd"/>
+      <w:r>
+        <w:t xml:space="preserve"> </w:t>
+      </w:r>
+      <w:proofErr w:type="spellStart"/>
+      <w:r>
+        <w:t>per</w:t>
+      </w:r>
+      <w:proofErr w:type="spellEnd"/>
+      <w:r>
+        <w:t xml:space="preserve"> </w:t>
+      </w:r>
+      <w:proofErr w:type="spellStart"/>
+      <w:r>
+        <w:t>group</w:t>
+      </w:r>
+      <w:proofErr w:type="spellEnd"/>
       <w:r>
         <w:t>)</w:t>
       </w:r>
@@ -7957,35 +8985,6 @@
         <w:t>:</w:t>
       </w:r>
       <w:r>
-        <w:t xml:space="preserve"> 8144</w:t>
-      </w:r>
-    </w:p>
-    <w:p>
-      <w:pPr>
-        <w:pStyle w:val="a6"/>
-      </w:pPr>
-      <w:r>
-        <w:t xml:space="preserve">Число </w:t>
-      </w:r>
-      <w:r>
-        <w:t xml:space="preserve">блоков </w:t>
-      </w:r>
-      <w:r>
-        <w:t>в группе</w:t>
-      </w:r>
-      <w:r>
-        <w:t xml:space="preserve"> (</w:t>
-      </w:r>
-      <w:r>
-        <w:t>blocks per group</w:t>
-      </w:r>
-      <w:r>
-        <w:t>)</w:t>
-      </w:r>
-      <w:r>
-        <w:t>:</w:t>
-      </w:r>
-      <w:r>
         <w:t xml:space="preserve"> </w:t>
       </w:r>
       <w:r>
@@ -8007,7 +9006,15 @@
         <w:pStyle w:val="a6"/>
       </w:pPr>
       <w:r>
-        <w:t>Создайте в домашнем каталоге текстовый файл размером не менее 10 Кб, содержимое которого должно содержать строки из символов латиницы, включая фамилии членов бригады. Можно скопировать любой файл, удовлетворяющий указанным требованиям, с локального компьютера с помощью утилиты WinSCP.</w:t>
+        <w:t xml:space="preserve">Создайте в домашнем каталоге текстовый файл размером не менее 10 Кб, содержимое которого должно содержать строки из символов латиницы, включая фамилии членов бригады. Можно скопировать любой файл, удовлетворяющий указанным требованиям, с локального компьютера с помощью утилиты </w:t>
+      </w:r>
+      <w:proofErr w:type="spellStart"/>
+      <w:r>
+        <w:t>WinSCP</w:t>
+      </w:r>
+      <w:proofErr w:type="spellEnd"/>
+      <w:r>
+        <w:t>.</w:t>
       </w:r>
     </w:p>
     <w:p>
@@ -8186,30 +9193,70 @@
       <w:r>
         <w:t xml:space="preserve">Определите номер дескриптора созданного файла командой </w:t>
       </w:r>
+      <w:proofErr w:type="spellStart"/>
       <w:r>
         <w:rPr>
           <w:b/>
         </w:rPr>
         <w:t>ls</w:t>
       </w:r>
+      <w:proofErr w:type="spellEnd"/>
       <w:r>
         <w:t xml:space="preserve"> и содержимое дескриптора командой </w:t>
       </w:r>
+      <w:proofErr w:type="spellStart"/>
       <w:r>
         <w:rPr>
           <w:b/>
         </w:rPr>
-        <w:t>sudo debugfs /dev/dm-0</w:t>
+        <w:t>sudo</w:t>
+      </w:r>
+      <w:proofErr w:type="spellEnd"/>
+      <w:r>
+        <w:rPr>
+          <w:b/>
+        </w:rPr>
+        <w:t xml:space="preserve"> </w:t>
+      </w:r>
+      <w:proofErr w:type="spellStart"/>
+      <w:r>
+        <w:rPr>
+          <w:b/>
+        </w:rPr>
+        <w:t>debugfs</w:t>
+      </w:r>
+      <w:proofErr w:type="spellEnd"/>
+      <w:r>
+        <w:rPr>
+          <w:b/>
+        </w:rPr>
+        <w:t xml:space="preserve"> /</w:t>
+      </w:r>
+      <w:proofErr w:type="spellStart"/>
+      <w:r>
+        <w:rPr>
+          <w:b/>
+        </w:rPr>
+        <w:t>dev</w:t>
+      </w:r>
+      <w:proofErr w:type="spellEnd"/>
+      <w:r>
+        <w:rPr>
+          <w:b/>
+        </w:rPr>
+        <w:t>/dm-0</w:t>
       </w:r>
       <w:r>
         <w:t xml:space="preserve">. После появления приглашения укажите номер дескриптора командой </w:t>
       </w:r>
+      <w:proofErr w:type="spellStart"/>
       <w:r>
         <w:rPr>
           <w:b/>
         </w:rPr>
         <w:t>stat</w:t>
       </w:r>
+      <w:proofErr w:type="spellEnd"/>
       <w:r>
         <w:t>.</w:t>
       </w:r>
@@ -8302,11 +9349,47 @@
       <w:r>
         <w:t xml:space="preserve">Вызываем команду </w:t>
       </w:r>
+      <w:proofErr w:type="spellStart"/>
       <w:r>
         <w:rPr>
           <w:b/>
         </w:rPr>
-        <w:t>sudo debugfs /dev/dm-0</w:t>
+        <w:t>sudo</w:t>
+      </w:r>
+      <w:proofErr w:type="spellEnd"/>
+      <w:r>
+        <w:rPr>
+          <w:b/>
+        </w:rPr>
+        <w:t xml:space="preserve"> </w:t>
+      </w:r>
+      <w:proofErr w:type="spellStart"/>
+      <w:r>
+        <w:rPr>
+          <w:b/>
+        </w:rPr>
+        <w:t>debugfs</w:t>
+      </w:r>
+      <w:proofErr w:type="spellEnd"/>
+      <w:r>
+        <w:rPr>
+          <w:b/>
+        </w:rPr>
+        <w:t xml:space="preserve"> /</w:t>
+      </w:r>
+      <w:proofErr w:type="spellStart"/>
+      <w:r>
+        <w:rPr>
+          <w:b/>
+        </w:rPr>
+        <w:t>dev</w:t>
+      </w:r>
+      <w:proofErr w:type="spellEnd"/>
+      <w:r>
+        <w:rPr>
+          <w:b/>
+        </w:rPr>
+        <w:t>/dm-0</w:t>
       </w:r>
       <w:r>
         <w:rPr>
@@ -8371,6 +9454,7 @@
       <w:r>
         <w:t xml:space="preserve">Подробная информация об </w:t>
       </w:r>
+      <w:proofErr w:type="spellStart"/>
       <w:r>
         <w:rPr>
           <w:b/>
@@ -8378,6 +9462,7 @@
         </w:rPr>
         <w:t>inode</w:t>
       </w:r>
+      <w:proofErr w:type="spellEnd"/>
       <w:r>
         <w:rPr>
           <w:lang w:val="en-US"/>
@@ -8438,13 +9523,53 @@
         <w:pStyle w:val="a6"/>
       </w:pPr>
       <w:r>
-        <w:t xml:space="preserve">С помощью Applications Menu запустите программу Web Browser, </w:t>
+        <w:t xml:space="preserve">С помощью </w:t>
+      </w:r>
+      <w:proofErr w:type="spellStart"/>
+      <w:r>
+        <w:t>Applications</w:t>
+      </w:r>
+      <w:proofErr w:type="spellEnd"/>
+      <w:r>
+        <w:t xml:space="preserve"> </w:t>
+      </w:r>
+      <w:proofErr w:type="spellStart"/>
+      <w:r>
+        <w:t>Menu</w:t>
+      </w:r>
+      <w:proofErr w:type="spellEnd"/>
+      <w:r>
+        <w:t xml:space="preserve"> запустите программу </w:t>
+      </w:r>
+      <w:proofErr w:type="spellStart"/>
+      <w:r>
+        <w:t>Web</w:t>
+      </w:r>
+      <w:proofErr w:type="spellEnd"/>
+      <w:r>
+        <w:t xml:space="preserve"> </w:t>
+      </w:r>
+      <w:proofErr w:type="spellStart"/>
+      <w:r>
+        <w:t>Browser</w:t>
+      </w:r>
+      <w:proofErr w:type="spellEnd"/>
+      <w:r>
+        <w:t xml:space="preserve">, </w:t>
       </w:r>
       <w:r>
         <w:t>скачайте</w:t>
       </w:r>
       <w:r>
-        <w:t xml:space="preserve"> в домашний каталог с сайта https://dmde.ru/download.html 64-битную версию дискового редактора DMDE для Linux и установите редактор. Все дальнейшие задания выполняются с помощью DMDE.</w:t>
+        <w:t xml:space="preserve"> в домашний каталог с сайта https://dmde.ru/download.html 64-битную версию дискового редактора DMDE для </w:t>
+      </w:r>
+      <w:proofErr w:type="spellStart"/>
+      <w:r>
+        <w:t>Linux</w:t>
+      </w:r>
+      <w:proofErr w:type="spellEnd"/>
+      <w:r>
+        <w:t xml:space="preserve"> и установите редактор. Все дальнейшие задания выполняются с помощью DMDE.</w:t>
       </w:r>
     </w:p>
     <w:p>
@@ -8507,12 +9632,14 @@
       <w:r>
         <w:t xml:space="preserve">Откройте устройство </w:t>
       </w:r>
+      <w:proofErr w:type="spellStart"/>
       <w:r>
         <w:rPr>
           <w:b/>
         </w:rPr>
         <w:t>sda</w:t>
       </w:r>
+      <w:proofErr w:type="spellEnd"/>
       <w:r>
         <w:t xml:space="preserve"> и определите его параметры (общий объем, размер сектора). Откройте логический диск </w:t>
       </w:r>
@@ -8520,7 +9647,21 @@
         <w:rPr>
           <w:b/>
         </w:rPr>
-        <w:t>/dev/dm-0</w:t>
+        <w:t>/</w:t>
+      </w:r>
+      <w:proofErr w:type="spellStart"/>
+      <w:r>
+        <w:rPr>
+          <w:b/>
+        </w:rPr>
+        <w:t>dev</w:t>
+      </w:r>
+      <w:proofErr w:type="spellEnd"/>
+      <w:r>
+        <w:rPr>
+          <w:b/>
+        </w:rPr>
+        <w:t>/dm-0</w:t>
       </w:r>
       <w:r>
         <w:t>, просмотрите содержимое файла, созданного в п.4, и определите номер его дескриптора.</w:t>
@@ -8533,6 +9674,7 @@
       <w:r>
         <w:t xml:space="preserve">Открыли устройство </w:t>
       </w:r>
+      <w:proofErr w:type="spellStart"/>
       <w:r>
         <w:rPr>
           <w:b/>
@@ -8540,6 +9682,7 @@
         </w:rPr>
         <w:t>sda</w:t>
       </w:r>
+      <w:proofErr w:type="spellEnd"/>
       <w:r>
         <w:rPr>
           <w:lang w:val="en-US"/>
@@ -8599,8 +9742,11 @@
       </w:r>
     </w:p>
     <w:p>
-      <w:bookmarkStart w:id="1" w:name="_GoBack"/>
-      <w:r>
+      <w:r>
+        <w:rPr>
+          <w:noProof/>
+          <w:lang w:eastAsia="ru-RU"/>
+        </w:rPr>
         <w:lastRenderedPageBreak/>
         <w:drawing>
           <wp:inline distT="0" distB="0" distL="0" distR="0" wp14:anchorId="56E9A9A7" wp14:editId="6C74885F">
@@ -8638,34 +9784,21 @@
           </wp:inline>
         </w:drawing>
       </w:r>
-      <w:bookmarkEnd w:id="1"/>
-    </w:p>
-    <w:p>
-      <w:pPr>
-        <w:pStyle w:val="a6"/>
-      </w:pPr>
-      <w:r>
-        <w:t>Общий объем:</w:t>
-      </w:r>
-      <w:r>
-        <w:t xml:space="preserve"> </w:t>
-      </w:r>
-      <w:r>
-        <w:t>21.5 Гб</w:t>
-      </w:r>
-    </w:p>
-    <w:p>
-      <w:pPr>
-        <w:pStyle w:val="a6"/>
-      </w:pPr>
-      <w:r>
-        <w:t>Р</w:t>
-      </w:r>
-      <w:r>
-        <w:t>азмер сектора</w:t>
-      </w:r>
-      <w:r>
-        <w:t>: 512 Б</w:t>
+    </w:p>
+    <w:p>
+      <w:pPr>
+        <w:pStyle w:val="a6"/>
+      </w:pPr>
+      <w:r>
+        <w:t>Общий объем: 21.5 Гб</w:t>
+      </w:r>
+    </w:p>
+    <w:p>
+      <w:pPr>
+        <w:pStyle w:val="a6"/>
+      </w:pPr>
+      <w:r>
+        <w:t>Размер сектора: 512 Б</w:t>
       </w:r>
     </w:p>
     <w:p>
@@ -8755,6 +9888,7 @@
       <w:r>
         <w:t xml:space="preserve">Информация об </w:t>
       </w:r>
+      <w:proofErr w:type="spellStart"/>
       <w:r>
         <w:rPr>
           <w:b/>
@@ -8762,6 +9896,7 @@
         </w:rPr>
         <w:t>inode</w:t>
       </w:r>
+      <w:proofErr w:type="spellEnd"/>
       <w:r>
         <w:rPr>
           <w:lang w:val="en-US"/>
@@ -8771,6 +9906,10 @@
     </w:p>
     <w:p>
       <w:r>
+        <w:rPr>
+          <w:noProof/>
+          <w:lang w:eastAsia="ru-RU"/>
+        </w:rPr>
         <w:drawing>
           <wp:inline distT="0" distB="0" distL="0" distR="0" wp14:anchorId="7C322DE8" wp14:editId="31615020">
             <wp:extent cx="5193792" cy="747177"/>
@@ -9068,7 +10207,15 @@
         <w:pStyle w:val="a6"/>
       </w:pPr>
       <w:r>
-        <w:t>В ходе выполнения данной лабораторной работы было проведено изучение файловых систем ОС Linux и освоены практические навыки использования команд для их анализа, а также для управления файлами и процессами.</w:t>
+        <w:t xml:space="preserve">В ходе выполнения данной лабораторной работы было проведено изучение файловых систем ОС </w:t>
+      </w:r>
+      <w:proofErr w:type="spellStart"/>
+      <w:r>
+        <w:t>Linux</w:t>
+      </w:r>
+      <w:proofErr w:type="spellEnd"/>
+      <w:r>
+        <w:t xml:space="preserve"> и освоены практические навыки использования команд для их анализа, а также для управления файлами и процессами.</w:t>
       </w:r>
     </w:p>
     <w:p>
@@ -9080,9 +10227,11 @@
       </w:pPr>
     </w:p>
     <w:sectPr>
+      <w:footerReference w:type="default" r:id="rId49"/>
       <w:pgSz w:w="11906" w:h="16838"/>
-      <w:pgMar w:top="1134" w:right="850" w:bottom="1134" w:left="1701" w:header="708" w:footer="708" w:gutter="0"/>
+      <w:pgMar w:top="1134" w:right="1304" w:bottom="1134" w:left="1418" w:header="680" w:footer="624" w:gutter="0"/>
       <w:cols w:space="708"/>
+      <w:titlePg/>
       <w:docGrid w:linePitch="360"/>
     </w:sectPr>
   </w:body>
@@ -9112,6 +10261,68 @@
     </w:p>
   </w:endnote>
 </w:endnotes>
+</file>
+
+<file path=word/footer1.xml><?xml version="1.0" encoding="utf-8"?>
+<w:ftr xmlns:wpc="http://schemas.microsoft.com/office/word/2010/wordprocessingCanvas" xmlns:cx="http://schemas.microsoft.com/office/drawing/2014/chartex" xmlns:cx1="http://schemas.microsoft.com/office/drawing/2015/9/8/chartex" xmlns:mc="http://schemas.openxmlformats.org/markup-compatibility/2006" xmlns:o="urn:schemas-microsoft-com:office:office" xmlns:r="http://schemas.openxmlformats.org/officeDocument/2006/relationships" xmlns:m="http://schemas.openxmlformats.org/officeDocument/2006/math" xmlns:v="urn:schemas-microsoft-com:vml" xmlns:wp14="http://schemas.microsoft.com/office/word/2010/wordprocessingDrawing" xmlns:wp="http://schemas.openxmlformats.org/drawingml/2006/wordprocessingDrawing" xmlns:w10="urn:schemas-microsoft-com:office:word" xmlns:w="http://schemas.openxmlformats.org/wordprocessingml/2006/main" xmlns:w14="http://schemas.microsoft.com/office/word/2010/wordml" xmlns:w15="http://schemas.microsoft.com/office/word/2012/wordml" xmlns:w16se="http://schemas.microsoft.com/office/word/2015/wordml/symex" xmlns:wpg="http://schemas.microsoft.com/office/word/2010/wordprocessingGroup" xmlns:wpi="http://schemas.microsoft.com/office/word/2010/wordprocessingInk" xmlns:wne="http://schemas.microsoft.com/office/word/2006/wordml" xmlns:wps="http://schemas.microsoft.com/office/word/2010/wordprocessingShape" mc:Ignorable="w14 w15 w16se wp14">
+  <w:sdt>
+    <w:sdtPr>
+      <w:id w:val="251249313"/>
+      <w:docPartObj>
+        <w:docPartGallery w:val="Page Numbers (Bottom of Page)"/>
+        <w:docPartUnique/>
+      </w:docPartObj>
+    </w:sdtPr>
+    <w:sdtEndPr>
+      <w:rPr>
+        <w:rFonts w:ascii="Times New Roman" w:hAnsi="Times New Roman" w:cs="Times New Roman"/>
+      </w:rPr>
+    </w:sdtEndPr>
+    <w:sdtContent>
+      <w:p>
+        <w:pPr>
+          <w:pStyle w:val="af1"/>
+          <w:ind w:left="-567" w:right="-455"/>
+          <w:jc w:val="center"/>
+          <w:rPr>
+            <w:rFonts w:ascii="Times New Roman" w:hAnsi="Times New Roman" w:cs="Times New Roman"/>
+          </w:rPr>
+        </w:pPr>
+        <w:r>
+          <w:rPr>
+            <w:rFonts w:ascii="Times New Roman" w:hAnsi="Times New Roman" w:cs="Times New Roman"/>
+          </w:rPr>
+          <w:fldChar w:fldCharType="begin"/>
+        </w:r>
+        <w:r>
+          <w:rPr>
+            <w:rFonts w:ascii="Times New Roman" w:hAnsi="Times New Roman" w:cs="Times New Roman"/>
+          </w:rPr>
+          <w:instrText>PAGE   \* MERGEFORMAT</w:instrText>
+        </w:r>
+        <w:r>
+          <w:rPr>
+            <w:rFonts w:ascii="Times New Roman" w:hAnsi="Times New Roman" w:cs="Times New Roman"/>
+          </w:rPr>
+          <w:fldChar w:fldCharType="separate"/>
+        </w:r>
+        <w:r>
+          <w:rPr>
+            <w:rFonts w:ascii="Times New Roman" w:hAnsi="Times New Roman" w:cs="Times New Roman"/>
+            <w:noProof/>
+          </w:rPr>
+          <w:t>17</w:t>
+        </w:r>
+        <w:r>
+          <w:rPr>
+            <w:rFonts w:ascii="Times New Roman" w:hAnsi="Times New Roman" w:cs="Times New Roman"/>
+          </w:rPr>
+          <w:fldChar w:fldCharType="end"/>
+        </w:r>
+      </w:p>
+    </w:sdtContent>
+  </w:sdt>
+</w:ftr>
 </file>
 
 <file path=word/footnotes.xml><?xml version="1.0" encoding="utf-8"?>
@@ -11136,6 +12347,7 @@
   <w:style w:type="character" w:default="1" w:styleId="a1">
     <w:name w:val="Default Paragraph Font"/>
     <w:uiPriority w:val="1"/>
+    <w:semiHidden/>
     <w:unhideWhenUsed/>
   </w:style>
   <w:style w:type="table" w:default="1" w:styleId="a2">
@@ -11879,6 +13091,7 @@
   <w:rsids>
     <w:rsidRoot w:val="009E16F2"/>
     <w:rsid w:val="001D5C09"/>
+    <w:rsid w:val="00270DB8"/>
     <w:rsid w:val="004D5638"/>
     <w:rsid w:val="006A1DEC"/>
     <w:rsid w:val="006C7299"/>
@@ -11890,8 +13103,10 @@
     <w:rsid w:val="009E16F2"/>
     <w:rsid w:val="00A46E70"/>
     <w:rsid w:val="00A85C21"/>
+    <w:rsid w:val="00BA2244"/>
     <w:rsid w:val="00BC18E7"/>
     <w:rsid w:val="00C8754C"/>
+    <w:rsid w:val="00DE4BEC"/>
     <w:rsid w:val="00E468C4"/>
     <w:rsid w:val="00EA2782"/>
     <w:rsid w:val="00FE7918"/>
@@ -12660,7 +13875,7 @@
 </file>
 
 <file path=customXml/itemProps1.xml><?xml version="1.0" encoding="utf-8"?>
-<ds:datastoreItem xmlns:ds="http://schemas.openxmlformats.org/officeDocument/2006/customXml" ds:itemID="{E4C04D2C-9A44-4E4E-BB74-C20A89408A7A}">
+<ds:datastoreItem xmlns:ds="http://schemas.openxmlformats.org/officeDocument/2006/customXml" ds:itemID="{703BFF1D-BBCB-4442-A172-E761344C5079}">
   <ds:schemaRefs>
     <ds:schemaRef ds:uri="http://schemas.openxmlformats.org/officeDocument/2006/bibliography"/>
   </ds:schemaRefs>

</xml_diff>